<commit_message>
created UML planning design
</commit_message>
<xml_diff>
--- a/08 - Spike - Game State Management/Task 08 - Lab Spike Report.docx
+++ b/08 - Spike - Game State Management/Task 08 - Lab Spike Report.docx
@@ -514,7 +514,15 @@
           <w:sz w:val="24"/>
           <w:szCs w:val="24"/>
         </w:rPr>
-        <w:t>Download and install Visual Studio</w:t>
+        <w:t xml:space="preserve">Planning </w:t>
+      </w:r>
+      <w:r>
+        <w:rPr>
+          <w:rStyle w:val="SubtleReference"/>
+          <w:sz w:val="24"/>
+          <w:szCs w:val="24"/>
+        </w:rPr>
+        <w:t>the Zorkish Adventure</w:t>
       </w:r>
     </w:p>
     <w:p>
@@ -537,15 +545,7 @@
           <w:sz w:val="24"/>
           <w:szCs w:val="24"/>
         </w:rPr>
-        <w:t xml:space="preserve">Download and install </w:t>
-      </w:r>
-      <w:r>
-        <w:rPr>
-          <w:rStyle w:val="SubtleReference"/>
-          <w:sz w:val="24"/>
-          <w:szCs w:val="24"/>
-        </w:rPr>
-        <w:t xml:space="preserve">Visual Studio C++ Debugging Packages </w:t>
+        <w:t>Download and install Visual Studio</w:t>
       </w:r>
     </w:p>
     <w:p>
@@ -568,6 +568,37 @@
           <w:sz w:val="24"/>
           <w:szCs w:val="24"/>
         </w:rPr>
+        <w:t xml:space="preserve">Download and install </w:t>
+      </w:r>
+      <w:r>
+        <w:rPr>
+          <w:rStyle w:val="SubtleReference"/>
+          <w:sz w:val="24"/>
+          <w:szCs w:val="24"/>
+        </w:rPr>
+        <w:t xml:space="preserve">Visual Studio C++ Debugging Packages </w:t>
+      </w:r>
+    </w:p>
+    <w:p>
+      <w:pPr>
+        <w:pStyle w:val="ColorfulList-Accent11"/>
+        <w:numPr>
+          <w:ilvl w:val="0"/>
+          <w:numId w:val="1"/>
+        </w:numPr>
+        <w:spacing w:line="360" w:lineRule="auto"/>
+        <w:rPr>
+          <w:rStyle w:val="SubtleReference"/>
+          <w:sz w:val="24"/>
+          <w:szCs w:val="24"/>
+        </w:rPr>
+      </w:pPr>
+      <w:r>
+        <w:rPr>
+          <w:rStyle w:val="SubtleReference"/>
+          <w:sz w:val="24"/>
+          <w:szCs w:val="24"/>
+        </w:rPr>
         <w:t xml:space="preserve">Create and </w:t>
       </w:r>
       <w:r>
@@ -615,11 +646,8 @@
       <w:pPr>
         <w:spacing w:line="360" w:lineRule="auto"/>
         <w:rPr>
-          <w:rStyle w:val="SubtleReference"/>
           <w:b/>
-          <w:color w:val="auto"/>
-          <w:sz w:val="24"/>
-          <w:szCs w:val="24"/>
+          <w:sz w:val="24"/>
         </w:rPr>
       </w:pPr>
       <w:r>
@@ -630,8 +658,143 @@
         <w:t>What we found out:</w:t>
       </w:r>
     </w:p>
+    <w:p>
+      <w:pPr>
+        <w:spacing w:line="360" w:lineRule="auto"/>
+        <w:rPr>
+          <w:b/>
+          <w:sz w:val="24"/>
+        </w:rPr>
+      </w:pPr>
+    </w:p>
+    <w:p>
+      <w:pPr>
+        <w:spacing w:line="360" w:lineRule="auto"/>
+        <w:rPr>
+          <w:b/>
+          <w:color w:val="767171" w:themeColor="background2" w:themeShade="80"/>
+          <w:sz w:val="28"/>
+          <w:szCs w:val="28"/>
+        </w:rPr>
+      </w:pPr>
+      <w:r>
+        <w:rPr>
+          <w:b/>
+          <w:color w:val="767171" w:themeColor="background2" w:themeShade="80"/>
+          <w:sz w:val="28"/>
+          <w:szCs w:val="28"/>
+        </w:rPr>
+        <w:t xml:space="preserve">Planning Phase: </w:t>
+      </w:r>
+    </w:p>
+    <w:p>
+      <w:pPr>
+        <w:spacing w:line="360" w:lineRule="auto"/>
+        <w:rPr>
+          <w:bCs/>
+          <w:color w:val="000000" w:themeColor="text1"/>
+          <w:sz w:val="24"/>
+        </w:rPr>
+      </w:pPr>
+      <w:r>
+        <w:rPr>
+          <w:bCs/>
+          <w:color w:val="000000" w:themeColor="text1"/>
+          <w:sz w:val="24"/>
+        </w:rPr>
+        <w:t>Based on the game specifications details and the requirements for phase 1 I designed this UML design that visualizes the Game State management and the structuring for the world and command processing.</w:t>
+      </w:r>
+    </w:p>
+    <w:p>
+      <w:pPr>
+        <w:keepNext/>
+        <w:spacing w:line="360" w:lineRule="auto"/>
+      </w:pPr>
+      <w:r>
+        <w:rPr>
+          <w:b/>
+          <w:noProof/>
+          <w:color w:val="000000" w:themeColor="text1"/>
+          <w:sz w:val="24"/>
+        </w:rPr>
+        <w:drawing>
+          <wp:inline distT="0" distB="0" distL="0" distR="0" wp14:anchorId="5A601FA4" wp14:editId="4977C4D0">
+            <wp:extent cx="6115050" cy="1885950"/>
+            <wp:effectExtent l="0" t="0" r="0" b="0"/>
+            <wp:docPr id="815511314" name="Picture 1"/>
+            <wp:cNvGraphicFramePr>
+              <a:graphicFrameLocks xmlns:a="http://schemas.openxmlformats.org/drawingml/2006/main" noChangeAspect="1"/>
+            </wp:cNvGraphicFramePr>
+            <a:graphic xmlns:a="http://schemas.openxmlformats.org/drawingml/2006/main">
+              <a:graphicData uri="http://schemas.openxmlformats.org/drawingml/2006/picture">
+                <pic:pic xmlns:pic="http://schemas.openxmlformats.org/drawingml/2006/picture">
+                  <pic:nvPicPr>
+                    <pic:cNvPr id="0" name="Picture 1"/>
+                    <pic:cNvPicPr>
+                      <a:picLocks noChangeAspect="1" noChangeArrowheads="1"/>
+                    </pic:cNvPicPr>
+                  </pic:nvPicPr>
+                  <pic:blipFill>
+                    <a:blip r:embed="rId7">
+                      <a:extLst>
+                        <a:ext uri="{28A0092B-C50C-407E-A947-70E740481C1C}">
+                          <a14:useLocalDpi xmlns:a14="http://schemas.microsoft.com/office/drawing/2010/main" val="0"/>
+                        </a:ext>
+                      </a:extLst>
+                    </a:blip>
+                    <a:srcRect/>
+                    <a:stretch>
+                      <a:fillRect/>
+                    </a:stretch>
+                  </pic:blipFill>
+                  <pic:spPr bwMode="auto">
+                    <a:xfrm>
+                      <a:off x="0" y="0"/>
+                      <a:ext cx="6115050" cy="1885950"/>
+                    </a:xfrm>
+                    <a:prstGeom prst="rect">
+                      <a:avLst/>
+                    </a:prstGeom>
+                    <a:noFill/>
+                    <a:ln>
+                      <a:noFill/>
+                    </a:ln>
+                  </pic:spPr>
+                </pic:pic>
+              </a:graphicData>
+            </a:graphic>
+          </wp:inline>
+        </w:drawing>
+      </w:r>
+    </w:p>
+    <w:p>
+      <w:pPr>
+        <w:pStyle w:val="Caption"/>
+        <w:rPr>
+          <w:rStyle w:val="SubtleReference"/>
+          <w:b/>
+          <w:color w:val="000000" w:themeColor="text1"/>
+          <w:sz w:val="24"/>
+          <w:szCs w:val="24"/>
+        </w:rPr>
+      </w:pPr>
+      <w:r>
+        <w:t xml:space="preserve">Figure </w:t>
+      </w:r>
+      <w:fldSimple w:instr=" SEQ Figure \* ARABIC ">
+        <w:r>
+          <w:rPr>
+            <w:noProof/>
+          </w:rPr>
+          <w:t>1</w:t>
+        </w:r>
+      </w:fldSimple>
+      <w:r>
+        <w:t xml:space="preserve"> : Initial UML Design for Phase 1 of Zorkish Adventure Game</w:t>
+      </w:r>
+    </w:p>
     <w:sectPr>
-      <w:headerReference w:type="default" r:id="rId7"/>
+      <w:headerReference w:type="default" r:id="rId8"/>
       <w:pgSz w:w="11900" w:h="16840"/>
       <w:pgMar w:top="1440" w:right="1134" w:bottom="1440" w:left="1134" w:header="709" w:footer="709" w:gutter="0"/>
       <w:cols w:space="708"/>
@@ -1655,6 +1818,25 @@
       </w:tblBorders>
     </w:tblPr>
   </w:style>
+  <w:style w:type="paragraph" w:styleId="Caption">
+    <w:name w:val="caption"/>
+    <w:basedOn w:val="Normal"/>
+    <w:next w:val="Normal"/>
+    <w:uiPriority w:val="35"/>
+    <w:unhideWhenUsed/>
+    <w:qFormat/>
+    <w:rsid w:val="00D84674"/>
+    <w:pPr>
+      <w:spacing w:after="200"/>
+    </w:pPr>
+    <w:rPr>
+      <w:i/>
+      <w:iCs/>
+      <w:color w:val="44546A" w:themeColor="text2"/>
+      <w:sz w:val="18"/>
+      <w:szCs w:val="18"/>
+    </w:rPr>
+  </w:style>
 </w:styles>
 </file>
 

</xml_diff>

<commit_message>
deleted task 8 due to not meeting the requirements.
</commit_message>
<xml_diff>
--- a/08 - Spike - Game State Management/Task 08 - Lab Spike Report.docx
+++ b/08 - Spike - Game State Management/Task 08 - Lab Spike Report.docx
@@ -146,7 +146,25 @@
           <w:sz w:val="24"/>
           <w:szCs w:val="24"/>
         </w:rPr>
-        <w:t>The goal of this spike task is to demonstrate my ability to collect and analyse software performance data while applying my knowledge in comparing and evaluating functions, IDE and complier settings.</w:t>
+        <w:t xml:space="preserve">The goal of this spike task is to demonstrate my ability to collect and analyse software performance data while applying my knowledge in comparing and evaluating functions, </w:t>
+      </w:r>
+      <w:proofErr w:type="gramStart"/>
+      <w:r>
+        <w:rPr>
+          <w:rStyle w:val="SubtleReference"/>
+          <w:sz w:val="24"/>
+          <w:szCs w:val="24"/>
+        </w:rPr>
+        <w:t>IDE</w:t>
+      </w:r>
+      <w:proofErr w:type="gramEnd"/>
+      <w:r>
+        <w:rPr>
+          <w:rStyle w:val="SubtleReference"/>
+          <w:sz w:val="24"/>
+          <w:szCs w:val="24"/>
+        </w:rPr>
+        <w:t xml:space="preserve"> and complier settings.</w:t>
       </w:r>
     </w:p>
     <w:p>
@@ -421,15 +439,7 @@
           <w:sz w:val="24"/>
           <w:szCs w:val="24"/>
         </w:rPr>
-        <w:t xml:space="preserve">2.2 Game States and Stages </w:t>
-      </w:r>
-      <w:r>
-        <w:rPr>
-          <w:rStyle w:val="SubtleReference"/>
-          <w:sz w:val="24"/>
-          <w:szCs w:val="24"/>
-        </w:rPr>
-        <w:t>Lecture Slides</w:t>
+        <w:t>2.2 Game States and Stages Lecture Slides</w:t>
       </w:r>
     </w:p>
     <w:p>
@@ -522,7 +532,25 @@
           <w:sz w:val="24"/>
           <w:szCs w:val="24"/>
         </w:rPr>
-        <w:t>the Zorkish Adventure</w:t>
+        <w:t xml:space="preserve">the </w:t>
+      </w:r>
+      <w:proofErr w:type="spellStart"/>
+      <w:r>
+        <w:rPr>
+          <w:rStyle w:val="SubtleReference"/>
+          <w:sz w:val="24"/>
+          <w:szCs w:val="24"/>
+        </w:rPr>
+        <w:t>Zorkish</w:t>
+      </w:r>
+      <w:proofErr w:type="spellEnd"/>
+      <w:r>
+        <w:rPr>
+          <w:rStyle w:val="SubtleReference"/>
+          <w:sz w:val="24"/>
+          <w:szCs w:val="24"/>
+        </w:rPr>
+        <w:t xml:space="preserve"> Adventure</w:t>
       </w:r>
     </w:p>
     <w:p>
@@ -615,7 +643,25 @@
           <w:sz w:val="24"/>
           <w:szCs w:val="24"/>
         </w:rPr>
-        <w:t>with a .cpp file to build.</w:t>
+        <w:t>with a .</w:t>
+      </w:r>
+      <w:proofErr w:type="spellStart"/>
+      <w:r>
+        <w:rPr>
+          <w:rStyle w:val="SubtleReference"/>
+          <w:sz w:val="24"/>
+          <w:szCs w:val="24"/>
+        </w:rPr>
+        <w:t>cpp</w:t>
+      </w:r>
+      <w:proofErr w:type="spellEnd"/>
+      <w:r>
+        <w:rPr>
+          <w:rStyle w:val="SubtleReference"/>
+          <w:sz w:val="24"/>
+          <w:szCs w:val="24"/>
+        </w:rPr>
+        <w:t xml:space="preserve"> file to build.</w:t>
       </w:r>
     </w:p>
     <w:p>
@@ -770,13 +816,6 @@
     <w:p>
       <w:pPr>
         <w:pStyle w:val="Caption"/>
-        <w:rPr>
-          <w:rStyle w:val="SubtleReference"/>
-          <w:b/>
-          <w:color w:val="000000" w:themeColor="text1"/>
-          <w:sz w:val="24"/>
-          <w:szCs w:val="24"/>
-        </w:rPr>
       </w:pPr>
       <w:r>
         <w:t xml:space="preserve">Figure </w:t>
@@ -790,9 +829,20 @@
         </w:r>
       </w:fldSimple>
       <w:r>
-        <w:t xml:space="preserve"> : Initial UML Design for Phase 1 of Zorkish Adventure Game</w:t>
-      </w:r>
-    </w:p>
+        <w:t xml:space="preserve"> : Initial UML Design for Phase 1 of </w:t>
+      </w:r>
+      <w:proofErr w:type="spellStart"/>
+      <w:r>
+        <w:t>Zorkish</w:t>
+      </w:r>
+      <w:proofErr w:type="spellEnd"/>
+      <w:r>
+        <w:t xml:space="preserve"> Adventure Game</w:t>
+      </w:r>
+    </w:p>
+    <w:p/>
+    <w:p/>
+    <w:p/>
     <w:sectPr>
       <w:headerReference w:type="default" r:id="rId8"/>
       <w:pgSz w:w="11900" w:h="16840"/>
@@ -875,7 +925,7 @@
       <w:rPr>
         <w:noProof/>
       </w:rPr>
-      <w:t>11/10/23</w:t>
+      <w:t>17/10/23</w:t>
     </w:r>
     <w:r>
       <w:fldChar w:fldCharType="end"/>
@@ -1696,6 +1746,7 @@
   <w:style w:type="character" w:default="1" w:styleId="DefaultParagraphFont">
     <w:name w:val="Default Paragraph Font"/>
     <w:uiPriority w:val="1"/>
+    <w:semiHidden/>
     <w:unhideWhenUsed/>
   </w:style>
   <w:style w:type="table" w:default="1" w:styleId="TableNormal">

</xml_diff>

<commit_message>
report task 8 complete
</commit_message>
<xml_diff>
--- a/08 - Spike - Game State Management/Task 08 - Lab Spike Report.docx
+++ b/08 - Spike - Game State Management/Task 08 - Lab Spike Report.docx
@@ -223,37 +223,72 @@
         <w:spacing w:line="360" w:lineRule="auto"/>
         <w:rPr>
           <w:rStyle w:val="SubtleReference"/>
-          <w:sz w:val="24"/>
-          <w:szCs w:val="24"/>
-        </w:rPr>
-      </w:pPr>
-      <w:r>
-        <w:rPr>
-          <w:rStyle w:val="SubtleReference"/>
-          <w:sz w:val="24"/>
-          <w:szCs w:val="24"/>
-        </w:rPr>
-        <w:t xml:space="preserve">Code see </w:t>
-      </w:r>
-      <w:r>
-        <w:rPr>
-          <w:rStyle w:val="SubtleReference"/>
-          <w:sz w:val="24"/>
-          <w:szCs w:val="24"/>
-        </w:rPr>
-        <w:t>COS30031-2023-102608927\08 - Spike - Game State Management</w:t>
-      </w:r>
-      <w:r>
-        <w:rPr>
-          <w:rStyle w:val="SubtleReference"/>
-          <w:sz w:val="24"/>
-          <w:szCs w:val="24"/>
-        </w:rPr>
-        <w:t>\Task8</w:t>
-      </w:r>
-    </w:p>
-    <w:p>
-      <w:pPr>
+        </w:rPr>
+      </w:pPr>
+      <w:r>
+        <w:rPr>
+          <w:rStyle w:val="SubtleReference"/>
+          <w:sz w:val="24"/>
+          <w:szCs w:val="24"/>
+        </w:rPr>
+        <w:t>Code</w:t>
+      </w:r>
+      <w:r>
+        <w:rPr>
+          <w:rStyle w:val="SubtleReference"/>
+          <w:sz w:val="24"/>
+          <w:szCs w:val="24"/>
+        </w:rPr>
+        <w:t xml:space="preserve"> files in</w:t>
+      </w:r>
+      <w:r>
+        <w:rPr>
+          <w:rStyle w:val="SubtleReference"/>
+          <w:sz w:val="24"/>
+          <w:szCs w:val="24"/>
+        </w:rPr>
+        <w:t xml:space="preserve"> see </w:t>
+      </w:r>
+      <w:r>
+        <w:rPr>
+          <w:rStyle w:val="SubtleReference"/>
+          <w:sz w:val="24"/>
+          <w:szCs w:val="24"/>
+        </w:rPr>
+        <w:t>C:\Users\storm\Documents\GitHub\GAMES PROGRAMMING REPO\COS30031-2023-102608927\08 - Spike - Game State Management\</w:t>
+      </w:r>
+      <w:proofErr w:type="spellStart"/>
+      <w:r>
+        <w:rPr>
+          <w:rStyle w:val="SubtleReference"/>
+          <w:sz w:val="24"/>
+          <w:szCs w:val="24"/>
+        </w:rPr>
+        <w:t>Zorkish</w:t>
+      </w:r>
+      <w:proofErr w:type="spellEnd"/>
+      <w:r>
+        <w:rPr>
+          <w:rStyle w:val="SubtleReference"/>
+          <w:sz w:val="24"/>
+          <w:szCs w:val="24"/>
+        </w:rPr>
+        <w:t>\</w:t>
+      </w:r>
+      <w:proofErr w:type="spellStart"/>
+      <w:r>
+        <w:rPr>
+          <w:rStyle w:val="SubtleReference"/>
+          <w:sz w:val="24"/>
+          <w:szCs w:val="24"/>
+        </w:rPr>
+        <w:t>Zorkish</w:t>
+      </w:r>
+      <w:proofErr w:type="spellEnd"/>
+    </w:p>
+    <w:p>
+      <w:pPr>
+        <w:pStyle w:val="ColorfulList-Accent11"/>
         <w:spacing w:line="360" w:lineRule="auto"/>
         <w:rPr>
           <w:rStyle w:val="SubtleReference"/>
@@ -701,6 +736,7 @@
           <w:b/>
           <w:sz w:val="24"/>
         </w:rPr>
+        <w:lastRenderedPageBreak/>
         <w:t>What we found out:</w:t>
       </w:r>
     </w:p>
@@ -756,18 +792,144 @@
         <w:keepNext/>
         <w:spacing w:line="360" w:lineRule="auto"/>
       </w:pPr>
-      <w:r>
+    </w:p>
+    <w:p>
+      <w:pPr>
+        <w:keepNext/>
+        <w:spacing w:line="360" w:lineRule="auto"/>
+      </w:pPr>
+      <w:r>
+        <w:drawing>
+          <wp:inline distT="0" distB="0" distL="0" distR="0" wp14:anchorId="27A9BC24" wp14:editId="7B64A5D3">
+            <wp:extent cx="4742688" cy="2416643"/>
+            <wp:effectExtent l="0" t="0" r="1270" b="3175"/>
+            <wp:docPr id="316402645" name="Picture 1" descr="A computer screen shot of a diagram&#10;&#10;Description automatically generated"/>
+            <wp:cNvGraphicFramePr>
+              <a:graphicFrameLocks xmlns:a="http://schemas.openxmlformats.org/drawingml/2006/main" noChangeAspect="1"/>
+            </wp:cNvGraphicFramePr>
+            <a:graphic xmlns:a="http://schemas.openxmlformats.org/drawingml/2006/main">
+              <a:graphicData uri="http://schemas.openxmlformats.org/drawingml/2006/picture">
+                <pic:pic xmlns:pic="http://schemas.openxmlformats.org/drawingml/2006/picture">
+                  <pic:nvPicPr>
+                    <pic:cNvPr id="316402645" name="Picture 1" descr="A computer screen shot of a diagram&#10;&#10;Description automatically generated"/>
+                    <pic:cNvPicPr/>
+                  </pic:nvPicPr>
+                  <pic:blipFill>
+                    <a:blip r:embed="rId7"/>
+                    <a:stretch>
+                      <a:fillRect/>
+                    </a:stretch>
+                  </pic:blipFill>
+                  <pic:spPr>
+                    <a:xfrm>
+                      <a:off x="0" y="0"/>
+                      <a:ext cx="4771953" cy="2431555"/>
+                    </a:xfrm>
+                    <a:prstGeom prst="rect">
+                      <a:avLst/>
+                    </a:prstGeom>
+                  </pic:spPr>
+                </pic:pic>
+              </a:graphicData>
+            </a:graphic>
+          </wp:inline>
+        </w:drawing>
+      </w:r>
+    </w:p>
+    <w:p>
+      <w:pPr>
+        <w:pStyle w:val="Caption"/>
+      </w:pPr>
+      <w:r>
+        <w:t xml:space="preserve">Figure </w:t>
+      </w:r>
+      <w:fldSimple w:instr=" SEQ Figure \* ARABIC ">
+        <w:r>
+          <w:rPr>
+            <w:noProof/>
+          </w:rPr>
+          <w:t>1</w:t>
+        </w:r>
+      </w:fldSimple>
+      <w:r>
+        <w:t xml:space="preserve"> : Initial UML Design for Phase 1 of </w:t>
+      </w:r>
+      <w:proofErr w:type="spellStart"/>
+      <w:r>
+        <w:t>Zorkish</w:t>
+      </w:r>
+      <w:proofErr w:type="spellEnd"/>
+      <w:r>
+        <w:t xml:space="preserve"> Adventure Game</w:t>
+      </w:r>
+    </w:p>
+    <w:p/>
+    <w:p/>
+    <w:p>
+      <w:pPr>
+        <w:spacing w:line="360" w:lineRule="auto"/>
         <w:rPr>
           <w:b/>
           <w:noProof/>
-          <w:color w:val="000000" w:themeColor="text1"/>
-          <w:sz w:val="24"/>
+          <w:color w:val="767171" w:themeColor="background2" w:themeShade="80"/>
+          <w:sz w:val="28"/>
+          <w:szCs w:val="28"/>
+        </w:rPr>
+      </w:pPr>
+      <w:r>
+        <w:rPr>
+          <w:b/>
+          <w:color w:val="767171" w:themeColor="background2" w:themeShade="80"/>
+          <w:sz w:val="28"/>
+          <w:szCs w:val="28"/>
+        </w:rPr>
+        <w:t xml:space="preserve">Developing State Class and </w:t>
+      </w:r>
+      <w:proofErr w:type="spellStart"/>
+      <w:r>
+        <w:rPr>
+          <w:b/>
+          <w:color w:val="767171" w:themeColor="background2" w:themeShade="80"/>
+          <w:sz w:val="28"/>
+          <w:szCs w:val="28"/>
+        </w:rPr>
+        <w:t>StateManager</w:t>
+      </w:r>
+      <w:proofErr w:type="spellEnd"/>
+      <w:r>
+        <w:rPr>
+          <w:b/>
+          <w:color w:val="767171" w:themeColor="background2" w:themeShade="80"/>
+          <w:sz w:val="28"/>
+          <w:szCs w:val="28"/>
+        </w:rPr>
+        <w:t xml:space="preserve">: </w:t>
+      </w:r>
+    </w:p>
+    <w:p>
+      <w:pPr>
+        <w:spacing w:line="360" w:lineRule="auto"/>
+        <w:rPr>
+          <w:b/>
+          <w:noProof/>
+          <w:color w:val="767171" w:themeColor="background2" w:themeShade="80"/>
+          <w:sz w:val="28"/>
+          <w:szCs w:val="28"/>
+        </w:rPr>
+      </w:pPr>
+      <w:r>
+        <w:rPr>
+          <w:b/>
+          <w:noProof/>
+          <w:color w:val="767171" w:themeColor="background2" w:themeShade="80"/>
+          <w:sz w:val="28"/>
+          <w:szCs w:val="28"/>
         </w:rPr>
         <w:drawing>
-          <wp:inline distT="0" distB="0" distL="0" distR="0" wp14:anchorId="5A601FA4" wp14:editId="4977C4D0">
-            <wp:extent cx="6115050" cy="1885950"/>
-            <wp:effectExtent l="0" t="0" r="0" b="0"/>
-            <wp:docPr id="815511314" name="Picture 1"/>
+          <wp:inline distT="0" distB="0" distL="0" distR="0" wp14:anchorId="6BE914B1" wp14:editId="0A309B6B">
+            <wp:extent cx="3364992" cy="1539495"/>
+            <wp:effectExtent l="0" t="0" r="6985" b="3810"/>
+            <wp:docPr id="755550337" name="Picture 1"/>
             <wp:cNvGraphicFramePr>
               <a:graphicFrameLocks xmlns:a="http://schemas.openxmlformats.org/drawingml/2006/main" noChangeAspect="1"/>
             </wp:cNvGraphicFramePr>
@@ -780,23 +942,21 @@
                       <a:picLocks noChangeAspect="1" noChangeArrowheads="1"/>
                     </pic:cNvPicPr>
                   </pic:nvPicPr>
-                  <pic:blipFill>
-                    <a:blip r:embed="rId7">
+                  <pic:blipFill rotWithShape="1">
+                    <a:blip r:embed="rId8">
                       <a:extLst>
                         <a:ext uri="{28A0092B-C50C-407E-A947-70E740481C1C}">
                           <a14:useLocalDpi xmlns:a14="http://schemas.microsoft.com/office/drawing/2010/main" val="0"/>
                         </a:ext>
                       </a:extLst>
                     </a:blip>
-                    <a:srcRect/>
-                    <a:stretch>
-                      <a:fillRect/>
-                    </a:stretch>
+                    <a:srcRect l="6620" t="12023" r="6579" b="12574"/>
+                    <a:stretch/>
                   </pic:blipFill>
                   <pic:spPr bwMode="auto">
                     <a:xfrm>
                       <a:off x="0" y="0"/>
-                      <a:ext cx="6115050" cy="1885950"/>
+                      <a:ext cx="3385347" cy="1548808"/>
                     </a:xfrm>
                     <a:prstGeom prst="rect">
                       <a:avLst/>
@@ -805,6 +965,11 @@
                     <a:ln>
                       <a:noFill/>
                     </a:ln>
+                    <a:extLst>
+                      <a:ext uri="{53640926-AAD7-44D8-BBD7-CCE9431645EC}">
+                        <a14:shadowObscured xmlns:a14="http://schemas.microsoft.com/office/drawing/2010/main"/>
+                      </a:ext>
+                    </a:extLst>
                   </pic:spPr>
                 </pic:pic>
               </a:graphicData>
@@ -815,36 +980,931 @@
     </w:p>
     <w:p>
       <w:pPr>
-        <w:pStyle w:val="Caption"/>
-      </w:pPr>
-      <w:r>
-        <w:t xml:space="preserve">Figure </w:t>
-      </w:r>
-      <w:fldSimple w:instr=" SEQ Figure \* ARABIC ">
-        <w:r>
-          <w:rPr>
-            <w:noProof/>
-          </w:rPr>
-          <w:t>1</w:t>
-        </w:r>
-      </w:fldSimple>
-      <w:r>
-        <w:t xml:space="preserve"> : Initial UML Design for Phase 1 of </w:t>
+        <w:spacing w:line="360" w:lineRule="auto"/>
+        <w:rPr>
+          <w:bCs/>
+          <w:noProof/>
+          <w:color w:val="000000" w:themeColor="text1"/>
+          <w:sz w:val="24"/>
+        </w:rPr>
+      </w:pPr>
+      <w:r>
+        <w:rPr>
+          <w:bCs/>
+          <w:noProof/>
+          <w:color w:val="000000" w:themeColor="text1"/>
+          <w:sz w:val="24"/>
+        </w:rPr>
+        <w:t>Based on my initial UML design the State header was created to estabilishes a clear methods that every state needs to initalize, run, terminate and handle inputs.</w:t>
+      </w:r>
+    </w:p>
+    <w:p>
+      <w:pPr>
+        <w:spacing w:line="360" w:lineRule="auto"/>
+        <w:rPr>
+          <w:b/>
+          <w:color w:val="767171" w:themeColor="background2" w:themeShade="80"/>
+          <w:sz w:val="28"/>
+          <w:szCs w:val="28"/>
+        </w:rPr>
+      </w:pPr>
+    </w:p>
+    <w:p>
+      <w:pPr>
+        <w:spacing w:line="360" w:lineRule="auto"/>
+        <w:rPr>
+          <w:b/>
+          <w:color w:val="767171" w:themeColor="background2" w:themeShade="80"/>
+          <w:sz w:val="28"/>
+          <w:szCs w:val="28"/>
+        </w:rPr>
+      </w:pPr>
+    </w:p>
+    <w:p>
+      <w:pPr>
+        <w:spacing w:line="360" w:lineRule="auto"/>
+        <w:rPr>
+          <w:b/>
+          <w:color w:val="767171" w:themeColor="background2" w:themeShade="80"/>
+          <w:sz w:val="28"/>
+          <w:szCs w:val="28"/>
+        </w:rPr>
+      </w:pPr>
+    </w:p>
+    <w:p>
+      <w:pPr>
+        <w:spacing w:line="360" w:lineRule="auto"/>
+        <w:jc w:val="both"/>
+        <w:rPr>
+          <w:bCs/>
+          <w:color w:val="000000" w:themeColor="text1"/>
+          <w:sz w:val="24"/>
+        </w:rPr>
+      </w:pPr>
+      <w:r>
+        <w:rPr>
+          <w:b/>
+          <w:noProof/>
+          <w:color w:val="767171" w:themeColor="background2" w:themeShade="80"/>
+          <w:sz w:val="28"/>
+          <w:szCs w:val="28"/>
+        </w:rPr>
+        <w:lastRenderedPageBreak/>
+        <w:drawing>
+          <wp:anchor distT="0" distB="0" distL="114300" distR="114300" simplePos="0" relativeHeight="251659264" behindDoc="0" locked="0" layoutInCell="1" allowOverlap="1" wp14:anchorId="7FCF724C" wp14:editId="4826204A">
+            <wp:simplePos x="0" y="0"/>
+            <wp:positionH relativeFrom="margin">
+              <wp:posOffset>3327400</wp:posOffset>
+            </wp:positionH>
+            <wp:positionV relativeFrom="paragraph">
+              <wp:posOffset>0</wp:posOffset>
+            </wp:positionV>
+            <wp:extent cx="2364740" cy="3279140"/>
+            <wp:effectExtent l="0" t="0" r="0" b="0"/>
+            <wp:wrapTopAndBottom/>
+            <wp:docPr id="2069948838" name="Picture 2"/>
+            <wp:cNvGraphicFramePr>
+              <a:graphicFrameLocks xmlns:a="http://schemas.openxmlformats.org/drawingml/2006/main" noChangeAspect="1"/>
+            </wp:cNvGraphicFramePr>
+            <a:graphic xmlns:a="http://schemas.openxmlformats.org/drawingml/2006/main">
+              <a:graphicData uri="http://schemas.openxmlformats.org/drawingml/2006/picture">
+                <pic:pic xmlns:pic="http://schemas.openxmlformats.org/drawingml/2006/picture">
+                  <pic:nvPicPr>
+                    <pic:cNvPr id="0" name="Picture 2"/>
+                    <pic:cNvPicPr>
+                      <a:picLocks noChangeAspect="1" noChangeArrowheads="1"/>
+                    </pic:cNvPicPr>
+                  </pic:nvPicPr>
+                  <pic:blipFill rotWithShape="1">
+                    <a:blip r:embed="rId9">
+                      <a:extLst>
+                        <a:ext uri="{28A0092B-C50C-407E-A947-70E740481C1C}">
+                          <a14:useLocalDpi xmlns:a14="http://schemas.microsoft.com/office/drawing/2010/main" val="0"/>
+                        </a:ext>
+                      </a:extLst>
+                    </a:blip>
+                    <a:srcRect l="6619" t="5054" r="7039" b="5466"/>
+                    <a:stretch/>
+                  </pic:blipFill>
+                  <pic:spPr bwMode="auto">
+                    <a:xfrm>
+                      <a:off x="0" y="0"/>
+                      <a:ext cx="2364740" cy="3279140"/>
+                    </a:xfrm>
+                    <a:prstGeom prst="rect">
+                      <a:avLst/>
+                    </a:prstGeom>
+                    <a:noFill/>
+                    <a:ln>
+                      <a:noFill/>
+                    </a:ln>
+                    <a:extLst>
+                      <a:ext uri="{53640926-AAD7-44D8-BBD7-CCE9431645EC}">
+                        <a14:shadowObscured xmlns:a14="http://schemas.microsoft.com/office/drawing/2010/main"/>
+                      </a:ext>
+                    </a:extLst>
+                  </pic:spPr>
+                </pic:pic>
+              </a:graphicData>
+            </a:graphic>
+            <wp14:sizeRelH relativeFrom="margin">
+              <wp14:pctWidth>0</wp14:pctWidth>
+            </wp14:sizeRelH>
+            <wp14:sizeRelV relativeFrom="margin">
+              <wp14:pctHeight>0</wp14:pctHeight>
+            </wp14:sizeRelV>
+          </wp:anchor>
+        </w:drawing>
+      </w:r>
+      <w:r>
+        <w:rPr>
+          <w:b/>
+          <w:noProof/>
+          <w:color w:val="767171" w:themeColor="background2" w:themeShade="80"/>
+          <w:sz w:val="28"/>
+          <w:szCs w:val="28"/>
+        </w:rPr>
+        <w:drawing>
+          <wp:anchor distT="0" distB="0" distL="114300" distR="114300" simplePos="0" relativeHeight="251658240" behindDoc="0" locked="0" layoutInCell="1" allowOverlap="1" wp14:anchorId="2EC70068" wp14:editId="67026B08">
+            <wp:simplePos x="0" y="0"/>
+            <wp:positionH relativeFrom="margin">
+              <wp:align>left</wp:align>
+            </wp:positionH>
+            <wp:positionV relativeFrom="paragraph">
+              <wp:posOffset>0</wp:posOffset>
+            </wp:positionV>
+            <wp:extent cx="2694305" cy="3256280"/>
+            <wp:effectExtent l="0" t="0" r="0" b="1270"/>
+            <wp:wrapTopAndBottom/>
+            <wp:docPr id="1616423376" name="Picture 4"/>
+            <wp:cNvGraphicFramePr>
+              <a:graphicFrameLocks xmlns:a="http://schemas.openxmlformats.org/drawingml/2006/main" noChangeAspect="1"/>
+            </wp:cNvGraphicFramePr>
+            <a:graphic xmlns:a="http://schemas.openxmlformats.org/drawingml/2006/main">
+              <a:graphicData uri="http://schemas.openxmlformats.org/drawingml/2006/picture">
+                <pic:pic xmlns:pic="http://schemas.openxmlformats.org/drawingml/2006/picture">
+                  <pic:nvPicPr>
+                    <pic:cNvPr id="0" name="Picture 4"/>
+                    <pic:cNvPicPr>
+                      <a:picLocks noChangeAspect="1" noChangeArrowheads="1"/>
+                    </pic:cNvPicPr>
+                  </pic:nvPicPr>
+                  <pic:blipFill rotWithShape="1">
+                    <a:blip r:embed="rId10">
+                      <a:extLst>
+                        <a:ext uri="{28A0092B-C50C-407E-A947-70E740481C1C}">
+                          <a14:useLocalDpi xmlns:a14="http://schemas.microsoft.com/office/drawing/2010/main" val="0"/>
+                        </a:ext>
+                      </a:extLst>
+                    </a:blip>
+                    <a:srcRect l="8777" t="8188" r="8772" b="8441"/>
+                    <a:stretch/>
+                  </pic:blipFill>
+                  <pic:spPr bwMode="auto">
+                    <a:xfrm>
+                      <a:off x="0" y="0"/>
+                      <a:ext cx="2710857" cy="3276407"/>
+                    </a:xfrm>
+                    <a:prstGeom prst="rect">
+                      <a:avLst/>
+                    </a:prstGeom>
+                    <a:noFill/>
+                    <a:ln>
+                      <a:noFill/>
+                    </a:ln>
+                    <a:extLst>
+                      <a:ext uri="{53640926-AAD7-44D8-BBD7-CCE9431645EC}">
+                        <a14:shadowObscured xmlns:a14="http://schemas.microsoft.com/office/drawing/2010/main"/>
+                      </a:ext>
+                    </a:extLst>
+                  </pic:spPr>
+                </pic:pic>
+              </a:graphicData>
+            </a:graphic>
+            <wp14:sizeRelH relativeFrom="margin">
+              <wp14:pctWidth>0</wp14:pctWidth>
+            </wp14:sizeRelH>
+            <wp14:sizeRelV relativeFrom="margin">
+              <wp14:pctHeight>0</wp14:pctHeight>
+            </wp14:sizeRelV>
+          </wp:anchor>
+        </w:drawing>
+      </w:r>
+      <w:r>
+        <w:rPr>
+          <w:b/>
+          <w:color w:val="767171" w:themeColor="background2" w:themeShade="80"/>
+          <w:sz w:val="28"/>
+          <w:szCs w:val="28"/>
+        </w:rPr>
+        <w:br/>
+      </w:r>
+      <w:r>
+        <w:rPr>
+          <w:bCs/>
+          <w:color w:val="000000" w:themeColor="text1"/>
+          <w:sz w:val="24"/>
+        </w:rPr>
+        <w:t xml:space="preserve">To manage these states, I created the </w:t>
       </w:r>
       <w:proofErr w:type="spellStart"/>
       <w:r>
-        <w:t>Zorkish</w:t>
+        <w:rPr>
+          <w:bCs/>
+          <w:color w:val="000000" w:themeColor="text1"/>
+          <w:sz w:val="24"/>
+        </w:rPr>
+        <w:t>StateManager</w:t>
       </w:r>
       <w:proofErr w:type="spellEnd"/>
       <w:r>
-        <w:t xml:space="preserve"> Adventure Game</w:t>
-      </w:r>
-    </w:p>
-    <w:p/>
-    <w:p/>
-    <w:p/>
+        <w:rPr>
+          <w:bCs/>
+          <w:color w:val="000000" w:themeColor="text1"/>
+          <w:sz w:val="24"/>
+        </w:rPr>
+        <w:t xml:space="preserve"> that connects with the games main loop each state and therefore I use the </w:t>
+      </w:r>
+      <w:proofErr w:type="spellStart"/>
+      <w:r>
+        <w:rPr>
+          <w:bCs/>
+          <w:color w:val="000000" w:themeColor="text1"/>
+          <w:sz w:val="24"/>
+        </w:rPr>
+        <w:t>currentstate</w:t>
+      </w:r>
+      <w:proofErr w:type="spellEnd"/>
+      <w:r>
+        <w:rPr>
+          <w:bCs/>
+          <w:color w:val="000000" w:themeColor="text1"/>
+          <w:sz w:val="24"/>
+        </w:rPr>
+        <w:t xml:space="preserve"> to manage and store the current state of the game. </w:t>
+      </w:r>
+      <w:proofErr w:type="spellStart"/>
+      <w:r>
+        <w:rPr>
+          <w:bCs/>
+          <w:color w:val="000000" w:themeColor="text1"/>
+          <w:sz w:val="24"/>
+        </w:rPr>
+        <w:t>StateManager</w:t>
+      </w:r>
+      <w:proofErr w:type="spellEnd"/>
+      <w:r>
+        <w:rPr>
+          <w:bCs/>
+          <w:color w:val="000000" w:themeColor="text1"/>
+          <w:sz w:val="24"/>
+        </w:rPr>
+        <w:t xml:space="preserve"> handles state transitions as well with methods such as </w:t>
+      </w:r>
+      <w:proofErr w:type="spellStart"/>
+      <w:r>
+        <w:rPr>
+          <w:bCs/>
+          <w:color w:val="000000" w:themeColor="text1"/>
+          <w:sz w:val="24"/>
+        </w:rPr>
+        <w:t>setState</w:t>
+      </w:r>
+      <w:proofErr w:type="spellEnd"/>
+      <w:r>
+        <w:rPr>
+          <w:bCs/>
+          <w:color w:val="000000" w:themeColor="text1"/>
+          <w:sz w:val="24"/>
+        </w:rPr>
+        <w:t xml:space="preserve"> and </w:t>
+      </w:r>
+      <w:proofErr w:type="spellStart"/>
+      <w:r>
+        <w:rPr>
+          <w:bCs/>
+          <w:color w:val="000000" w:themeColor="text1"/>
+          <w:sz w:val="24"/>
+        </w:rPr>
+        <w:t>changeState</w:t>
+      </w:r>
+      <w:proofErr w:type="spellEnd"/>
+      <w:r>
+        <w:rPr>
+          <w:bCs/>
+          <w:color w:val="000000" w:themeColor="text1"/>
+          <w:sz w:val="24"/>
+        </w:rPr>
+        <w:t xml:space="preserve"> to make sure that one instance of </w:t>
+      </w:r>
+      <w:proofErr w:type="spellStart"/>
+      <w:r>
+        <w:rPr>
+          <w:bCs/>
+          <w:color w:val="000000" w:themeColor="text1"/>
+          <w:sz w:val="24"/>
+        </w:rPr>
+        <w:t>StateManager</w:t>
+      </w:r>
+      <w:proofErr w:type="spellEnd"/>
+      <w:r>
+        <w:rPr>
+          <w:bCs/>
+          <w:color w:val="000000" w:themeColor="text1"/>
+          <w:sz w:val="24"/>
+        </w:rPr>
+        <w:t xml:space="preserve"> exists at a time by using Singleton pattern.</w:t>
+      </w:r>
+    </w:p>
+    <w:p>
+      <w:pPr>
+        <w:spacing w:line="360" w:lineRule="auto"/>
+        <w:jc w:val="both"/>
+        <w:rPr>
+          <w:b/>
+          <w:color w:val="767171" w:themeColor="background2" w:themeShade="80"/>
+          <w:sz w:val="28"/>
+          <w:szCs w:val="28"/>
+        </w:rPr>
+      </w:pPr>
+    </w:p>
+    <w:p>
+      <w:pPr>
+        <w:spacing w:line="360" w:lineRule="auto"/>
+        <w:rPr>
+          <w:b/>
+          <w:color w:val="767171" w:themeColor="background2" w:themeShade="80"/>
+          <w:sz w:val="28"/>
+          <w:szCs w:val="28"/>
+        </w:rPr>
+      </w:pPr>
+      <w:r>
+        <w:rPr>
+          <w:b/>
+          <w:color w:val="767171" w:themeColor="background2" w:themeShade="80"/>
+          <w:sz w:val="28"/>
+          <w:szCs w:val="28"/>
+        </w:rPr>
+        <w:t>Developing Basic States</w:t>
+      </w:r>
+      <w:r>
+        <w:rPr>
+          <w:b/>
+          <w:color w:val="767171" w:themeColor="background2" w:themeShade="80"/>
+          <w:sz w:val="28"/>
+          <w:szCs w:val="28"/>
+        </w:rPr>
+        <w:t xml:space="preserve">: </w:t>
+      </w:r>
+    </w:p>
+    <w:p>
+      <w:pPr>
+        <w:spacing w:line="360" w:lineRule="auto"/>
+        <w:rPr>
+          <w:b/>
+          <w:noProof/>
+          <w:color w:val="767171" w:themeColor="background2" w:themeShade="80"/>
+          <w:sz w:val="28"/>
+          <w:szCs w:val="28"/>
+        </w:rPr>
+      </w:pPr>
+    </w:p>
+    <w:p>
+      <w:pPr>
+        <w:spacing w:line="360" w:lineRule="auto"/>
+        <w:jc w:val="both"/>
+        <w:rPr>
+          <w:bCs/>
+          <w:noProof/>
+          <w:color w:val="000000" w:themeColor="text1"/>
+          <w:sz w:val="24"/>
+        </w:rPr>
+      </w:pPr>
+      <w:r>
+        <w:rPr>
+          <w:bCs/>
+          <w:noProof/>
+          <w:color w:val="000000" w:themeColor="text1"/>
+          <w:sz w:val="24"/>
+        </w:rPr>
+        <w:t>When developing basic states such as Mainmenu, we use the header file for MainMenu to be the blueprint that inherits from State.h so does other states with their own header file that inherits from State.h as well as we want to make sure our code follows OOP design principles.</w:t>
+      </w:r>
+    </w:p>
+    <w:p>
+      <w:pPr>
+        <w:spacing w:line="360" w:lineRule="auto"/>
+        <w:jc w:val="both"/>
+        <w:rPr>
+          <w:bCs/>
+          <w:noProof/>
+          <w:color w:val="000000" w:themeColor="text1"/>
+          <w:sz w:val="24"/>
+        </w:rPr>
+      </w:pPr>
+      <w:r>
+        <w:rPr>
+          <w:bCs/>
+          <w:noProof/>
+          <w:color w:val="000000" w:themeColor="text1"/>
+          <w:sz w:val="24"/>
+        </w:rPr>
+        <w:drawing>
+          <wp:inline distT="0" distB="0" distL="0" distR="0" wp14:anchorId="2DAE3259" wp14:editId="01C76690">
+            <wp:extent cx="2340864" cy="1985761"/>
+            <wp:effectExtent l="0" t="0" r="2540" b="0"/>
+            <wp:docPr id="158297723" name="Picture 6"/>
+            <wp:cNvGraphicFramePr>
+              <a:graphicFrameLocks xmlns:a="http://schemas.openxmlformats.org/drawingml/2006/main" noChangeAspect="1"/>
+            </wp:cNvGraphicFramePr>
+            <a:graphic xmlns:a="http://schemas.openxmlformats.org/drawingml/2006/main">
+              <a:graphicData uri="http://schemas.openxmlformats.org/drawingml/2006/picture">
+                <pic:pic xmlns:pic="http://schemas.openxmlformats.org/drawingml/2006/picture">
+                  <pic:nvPicPr>
+                    <pic:cNvPr id="0" name="Picture 6"/>
+                    <pic:cNvPicPr>
+                      <a:picLocks noChangeAspect="1" noChangeArrowheads="1"/>
+                    </pic:cNvPicPr>
+                  </pic:nvPicPr>
+                  <pic:blipFill rotWithShape="1">
+                    <a:blip r:embed="rId11">
+                      <a:extLst>
+                        <a:ext uri="{28A0092B-C50C-407E-A947-70E740481C1C}">
+                          <a14:useLocalDpi xmlns:a14="http://schemas.microsoft.com/office/drawing/2010/main" val="0"/>
+                        </a:ext>
+                      </a:extLst>
+                    </a:blip>
+                    <a:srcRect l="9979" t="11261" r="9779" b="11935"/>
+                    <a:stretch/>
+                  </pic:blipFill>
+                  <pic:spPr bwMode="auto">
+                    <a:xfrm>
+                      <a:off x="0" y="0"/>
+                      <a:ext cx="2344431" cy="1988787"/>
+                    </a:xfrm>
+                    <a:prstGeom prst="rect">
+                      <a:avLst/>
+                    </a:prstGeom>
+                    <a:noFill/>
+                    <a:ln>
+                      <a:noFill/>
+                    </a:ln>
+                    <a:extLst>
+                      <a:ext uri="{53640926-AAD7-44D8-BBD7-CCE9431645EC}">
+                        <a14:shadowObscured xmlns:a14="http://schemas.microsoft.com/office/drawing/2010/main"/>
+                      </a:ext>
+                    </a:extLst>
+                  </pic:spPr>
+                </pic:pic>
+              </a:graphicData>
+            </a:graphic>
+          </wp:inline>
+        </w:drawing>
+      </w:r>
+    </w:p>
+    <w:p>
+      <w:pPr>
+        <w:spacing w:line="360" w:lineRule="auto"/>
+        <w:jc w:val="both"/>
+        <w:rPr>
+          <w:bCs/>
+          <w:color w:val="000000" w:themeColor="text1"/>
+          <w:sz w:val="24"/>
+        </w:rPr>
+      </w:pPr>
+      <w:r>
+        <w:rPr>
+          <w:b/>
+          <w:noProof/>
+          <w:color w:val="767171" w:themeColor="background2" w:themeShade="80"/>
+          <w:sz w:val="28"/>
+          <w:szCs w:val="28"/>
+        </w:rPr>
+        <w:lastRenderedPageBreak/>
+        <w:drawing>
+          <wp:anchor distT="0" distB="0" distL="114300" distR="114300" simplePos="0" relativeHeight="251660288" behindDoc="0" locked="0" layoutInCell="1" allowOverlap="1" wp14:anchorId="62DBE6FC" wp14:editId="30F595E3">
+            <wp:simplePos x="0" y="0"/>
+            <wp:positionH relativeFrom="margin">
+              <wp:align>left</wp:align>
+            </wp:positionH>
+            <wp:positionV relativeFrom="paragraph">
+              <wp:posOffset>0</wp:posOffset>
+            </wp:positionV>
+            <wp:extent cx="3230880" cy="4717415"/>
+            <wp:effectExtent l="0" t="0" r="7620" b="6985"/>
+            <wp:wrapSquare wrapText="bothSides"/>
+            <wp:docPr id="529678827" name="Picture 5"/>
+            <wp:cNvGraphicFramePr>
+              <a:graphicFrameLocks xmlns:a="http://schemas.openxmlformats.org/drawingml/2006/main" noChangeAspect="1"/>
+            </wp:cNvGraphicFramePr>
+            <a:graphic xmlns:a="http://schemas.openxmlformats.org/drawingml/2006/main">
+              <a:graphicData uri="http://schemas.openxmlformats.org/drawingml/2006/picture">
+                <pic:pic xmlns:pic="http://schemas.openxmlformats.org/drawingml/2006/picture">
+                  <pic:nvPicPr>
+                    <pic:cNvPr id="0" name="Picture 5"/>
+                    <pic:cNvPicPr>
+                      <a:picLocks noChangeAspect="1" noChangeArrowheads="1"/>
+                    </pic:cNvPicPr>
+                  </pic:nvPicPr>
+                  <pic:blipFill rotWithShape="1">
+                    <a:blip r:embed="rId12">
+                      <a:extLst>
+                        <a:ext uri="{28A0092B-C50C-407E-A947-70E740481C1C}">
+                          <a14:useLocalDpi xmlns:a14="http://schemas.microsoft.com/office/drawing/2010/main" val="0"/>
+                        </a:ext>
+                      </a:extLst>
+                    </a:blip>
+                    <a:srcRect l="4592" t="3516" r="5183" b="3648"/>
+                    <a:stretch/>
+                  </pic:blipFill>
+                  <pic:spPr bwMode="auto">
+                    <a:xfrm>
+                      <a:off x="0" y="0"/>
+                      <a:ext cx="3230880" cy="4717415"/>
+                    </a:xfrm>
+                    <a:prstGeom prst="rect">
+                      <a:avLst/>
+                    </a:prstGeom>
+                    <a:noFill/>
+                    <a:ln>
+                      <a:noFill/>
+                    </a:ln>
+                    <a:extLst>
+                      <a:ext uri="{53640926-AAD7-44D8-BBD7-CCE9431645EC}">
+                        <a14:shadowObscured xmlns:a14="http://schemas.microsoft.com/office/drawing/2010/main"/>
+                      </a:ext>
+                    </a:extLst>
+                  </pic:spPr>
+                </pic:pic>
+              </a:graphicData>
+            </a:graphic>
+            <wp14:sizeRelH relativeFrom="page">
+              <wp14:pctWidth>0</wp14:pctWidth>
+            </wp14:sizeRelH>
+            <wp14:sizeRelV relativeFrom="page">
+              <wp14:pctHeight>0</wp14:pctHeight>
+            </wp14:sizeRelV>
+          </wp:anchor>
+        </w:drawing>
+      </w:r>
+      <w:r>
+        <w:rPr>
+          <w:bCs/>
+          <w:color w:val="000000" w:themeColor="text1"/>
+          <w:sz w:val="24"/>
+        </w:rPr>
+        <w:t xml:space="preserve">The </w:t>
+      </w:r>
+      <w:proofErr w:type="spellStart"/>
+      <w:r>
+        <w:rPr>
+          <w:bCs/>
+          <w:color w:val="000000" w:themeColor="text1"/>
+          <w:sz w:val="24"/>
+        </w:rPr>
+        <w:t>MainMenu</w:t>
+      </w:r>
+      <w:proofErr w:type="spellEnd"/>
+      <w:r>
+        <w:rPr>
+          <w:bCs/>
+          <w:color w:val="000000" w:themeColor="text1"/>
+          <w:sz w:val="24"/>
+        </w:rPr>
+        <w:t xml:space="preserve"> class utilises the initialize method to present a list of options for the user, </w:t>
+      </w:r>
+      <w:proofErr w:type="spellStart"/>
+      <w:r>
+        <w:rPr>
+          <w:bCs/>
+          <w:color w:val="000000" w:themeColor="text1"/>
+          <w:sz w:val="24"/>
+        </w:rPr>
+        <w:t>handleInput</w:t>
+      </w:r>
+      <w:proofErr w:type="spellEnd"/>
+      <w:r>
+        <w:rPr>
+          <w:bCs/>
+          <w:color w:val="000000" w:themeColor="text1"/>
+          <w:sz w:val="24"/>
+        </w:rPr>
+        <w:t xml:space="preserve"> method processes the user inputs using switch case where options are 1 to 5 that </w:t>
+      </w:r>
+      <w:r>
+        <w:rPr>
+          <w:bCs/>
+          <w:color w:val="000000" w:themeColor="text1"/>
+          <w:sz w:val="24"/>
+        </w:rPr>
+        <w:t>correspond to switching between states or exiting the game.</w:t>
+      </w:r>
+      <w:r>
+        <w:rPr>
+          <w:bCs/>
+          <w:color w:val="000000" w:themeColor="text1"/>
+          <w:sz w:val="24"/>
+        </w:rPr>
+        <w:t xml:space="preserve"> Other states use similar initialization and </w:t>
+      </w:r>
+      <w:proofErr w:type="spellStart"/>
+      <w:r>
+        <w:rPr>
+          <w:bCs/>
+          <w:color w:val="000000" w:themeColor="text1"/>
+          <w:sz w:val="24"/>
+        </w:rPr>
+        <w:t>handleInput</w:t>
+      </w:r>
+      <w:proofErr w:type="spellEnd"/>
+      <w:r>
+        <w:rPr>
+          <w:bCs/>
+          <w:color w:val="000000" w:themeColor="text1"/>
+          <w:sz w:val="24"/>
+        </w:rPr>
+        <w:t xml:space="preserve"> methods that bring it back to </w:t>
+      </w:r>
+      <w:proofErr w:type="spellStart"/>
+      <w:r>
+        <w:rPr>
+          <w:bCs/>
+          <w:color w:val="000000" w:themeColor="text1"/>
+          <w:sz w:val="24"/>
+        </w:rPr>
+        <w:t>MainMenu</w:t>
+      </w:r>
+      <w:proofErr w:type="spellEnd"/>
+      <w:r>
+        <w:rPr>
+          <w:bCs/>
+          <w:color w:val="000000" w:themeColor="text1"/>
+          <w:sz w:val="24"/>
+        </w:rPr>
+        <w:t xml:space="preserve"> state.</w:t>
+      </w:r>
+    </w:p>
+    <w:p>
+      <w:pPr>
+        <w:spacing w:line="360" w:lineRule="auto"/>
+        <w:rPr>
+          <w:bCs/>
+          <w:color w:val="000000" w:themeColor="text1"/>
+          <w:sz w:val="24"/>
+        </w:rPr>
+      </w:pPr>
+    </w:p>
+    <w:p>
+      <w:pPr>
+        <w:spacing w:line="360" w:lineRule="auto"/>
+        <w:rPr>
+          <w:b/>
+          <w:color w:val="767171" w:themeColor="background2" w:themeShade="80"/>
+          <w:sz w:val="28"/>
+          <w:szCs w:val="28"/>
+        </w:rPr>
+      </w:pPr>
+    </w:p>
+    <w:p>
+      <w:pPr>
+        <w:spacing w:line="360" w:lineRule="auto"/>
+        <w:rPr>
+          <w:b/>
+          <w:color w:val="767171" w:themeColor="background2" w:themeShade="80"/>
+          <w:sz w:val="28"/>
+          <w:szCs w:val="28"/>
+        </w:rPr>
+      </w:pPr>
+    </w:p>
+    <w:p>
+      <w:pPr>
+        <w:spacing w:line="360" w:lineRule="auto"/>
+        <w:rPr>
+          <w:b/>
+          <w:color w:val="767171" w:themeColor="background2" w:themeShade="80"/>
+          <w:sz w:val="28"/>
+          <w:szCs w:val="28"/>
+        </w:rPr>
+      </w:pPr>
+    </w:p>
+    <w:p>
+      <w:pPr>
+        <w:spacing w:line="360" w:lineRule="auto"/>
+        <w:rPr>
+          <w:b/>
+          <w:color w:val="767171" w:themeColor="background2" w:themeShade="80"/>
+          <w:sz w:val="28"/>
+          <w:szCs w:val="28"/>
+        </w:rPr>
+      </w:pPr>
+    </w:p>
+    <w:p>
+      <w:pPr>
+        <w:spacing w:line="360" w:lineRule="auto"/>
+        <w:rPr>
+          <w:b/>
+          <w:color w:val="767171" w:themeColor="background2" w:themeShade="80"/>
+          <w:sz w:val="28"/>
+          <w:szCs w:val="28"/>
+        </w:rPr>
+      </w:pPr>
+    </w:p>
+    <w:p>
+      <w:pPr>
+        <w:spacing w:line="360" w:lineRule="auto"/>
+        <w:rPr>
+          <w:b/>
+          <w:color w:val="767171" w:themeColor="background2" w:themeShade="80"/>
+          <w:sz w:val="28"/>
+          <w:szCs w:val="28"/>
+        </w:rPr>
+      </w:pPr>
+    </w:p>
+    <w:p>
+      <w:pPr>
+        <w:spacing w:line="360" w:lineRule="auto"/>
+        <w:rPr>
+          <w:b/>
+          <w:color w:val="767171" w:themeColor="background2" w:themeShade="80"/>
+          <w:sz w:val="28"/>
+          <w:szCs w:val="28"/>
+        </w:rPr>
+      </w:pPr>
+    </w:p>
+    <w:p>
+      <w:pPr>
+        <w:spacing w:line="360" w:lineRule="auto"/>
+        <w:rPr>
+          <w:b/>
+          <w:color w:val="767171" w:themeColor="background2" w:themeShade="80"/>
+          <w:sz w:val="28"/>
+          <w:szCs w:val="28"/>
+        </w:rPr>
+      </w:pPr>
+    </w:p>
+    <w:p>
+      <w:pPr>
+        <w:spacing w:line="360" w:lineRule="auto"/>
+        <w:rPr>
+          <w:b/>
+          <w:color w:val="767171" w:themeColor="background2" w:themeShade="80"/>
+          <w:sz w:val="28"/>
+          <w:szCs w:val="28"/>
+        </w:rPr>
+      </w:pPr>
+      <w:r>
+        <w:rPr>
+          <w:b/>
+          <w:color w:val="767171" w:themeColor="background2" w:themeShade="80"/>
+          <w:sz w:val="28"/>
+          <w:szCs w:val="28"/>
+        </w:rPr>
+        <w:t>Gameplay</w:t>
+      </w:r>
+      <w:r>
+        <w:rPr>
+          <w:b/>
+          <w:color w:val="767171" w:themeColor="background2" w:themeShade="80"/>
+          <w:sz w:val="28"/>
+          <w:szCs w:val="28"/>
+        </w:rPr>
+        <w:t xml:space="preserve"> Phase</w:t>
+      </w:r>
+      <w:r>
+        <w:rPr>
+          <w:b/>
+          <w:color w:val="767171" w:themeColor="background2" w:themeShade="80"/>
+          <w:sz w:val="28"/>
+          <w:szCs w:val="28"/>
+        </w:rPr>
+        <w:t xml:space="preserve"> 1 </w:t>
+      </w:r>
+      <w:r>
+        <w:rPr>
+          <w:b/>
+          <w:color w:val="767171" w:themeColor="background2" w:themeShade="80"/>
+          <w:sz w:val="28"/>
+          <w:szCs w:val="28"/>
+        </w:rPr>
+        <w:t>Functionality:</w:t>
+      </w:r>
+      <w:r>
+        <w:rPr>
+          <w:b/>
+          <w:color w:val="767171" w:themeColor="background2" w:themeShade="80"/>
+          <w:sz w:val="28"/>
+          <w:szCs w:val="28"/>
+        </w:rPr>
+        <w:t xml:space="preserve"> </w:t>
+      </w:r>
+    </w:p>
+    <w:p>
+      <w:pPr>
+        <w:rPr>
+          <w:noProof/>
+        </w:rPr>
+      </w:pPr>
+    </w:p>
+    <w:p>
+      <w:pPr>
+        <w:spacing w:line="360" w:lineRule="auto"/>
+        <w:jc w:val="both"/>
+      </w:pPr>
+      <w:r>
+        <w:rPr>
+          <w:noProof/>
+        </w:rPr>
+        <w:drawing>
+          <wp:anchor distT="0" distB="0" distL="114300" distR="114300" simplePos="0" relativeHeight="251661312" behindDoc="0" locked="0" layoutInCell="1" allowOverlap="1" wp14:anchorId="7C91650F" wp14:editId="1D0B03B4">
+            <wp:simplePos x="0" y="0"/>
+            <wp:positionH relativeFrom="column">
+              <wp:posOffset>-243</wp:posOffset>
+            </wp:positionH>
+            <wp:positionV relativeFrom="paragraph">
+              <wp:posOffset>297</wp:posOffset>
+            </wp:positionV>
+            <wp:extent cx="3667327" cy="3086004"/>
+            <wp:effectExtent l="0" t="0" r="0" b="635"/>
+            <wp:wrapSquare wrapText="bothSides"/>
+            <wp:docPr id="1708141556" name="Picture 7"/>
+            <wp:cNvGraphicFramePr>
+              <a:graphicFrameLocks xmlns:a="http://schemas.openxmlformats.org/drawingml/2006/main" noChangeAspect="1"/>
+            </wp:cNvGraphicFramePr>
+            <a:graphic xmlns:a="http://schemas.openxmlformats.org/drawingml/2006/main">
+              <a:graphicData uri="http://schemas.openxmlformats.org/drawingml/2006/picture">
+                <pic:pic xmlns:pic="http://schemas.openxmlformats.org/drawingml/2006/picture">
+                  <pic:nvPicPr>
+                    <pic:cNvPr id="0" name="Picture 7"/>
+                    <pic:cNvPicPr>
+                      <a:picLocks noChangeAspect="1" noChangeArrowheads="1"/>
+                    </pic:cNvPicPr>
+                  </pic:nvPicPr>
+                  <pic:blipFill rotWithShape="1">
+                    <a:blip r:embed="rId13">
+                      <a:extLst>
+                        <a:ext uri="{28A0092B-C50C-407E-A947-70E740481C1C}">
+                          <a14:useLocalDpi xmlns:a14="http://schemas.microsoft.com/office/drawing/2010/main" val="0"/>
+                        </a:ext>
+                      </a:extLst>
+                    </a:blip>
+                    <a:srcRect l="4299" t="4503" r="5231" b="5802"/>
+                    <a:stretch/>
+                  </pic:blipFill>
+                  <pic:spPr bwMode="auto">
+                    <a:xfrm>
+                      <a:off x="0" y="0"/>
+                      <a:ext cx="3667327" cy="3086004"/>
+                    </a:xfrm>
+                    <a:prstGeom prst="rect">
+                      <a:avLst/>
+                    </a:prstGeom>
+                    <a:noFill/>
+                    <a:ln>
+                      <a:noFill/>
+                    </a:ln>
+                    <a:extLst>
+                      <a:ext uri="{53640926-AAD7-44D8-BBD7-CCE9431645EC}">
+                        <a14:shadowObscured xmlns:a14="http://schemas.microsoft.com/office/drawing/2010/main"/>
+                      </a:ext>
+                    </a:extLst>
+                  </pic:spPr>
+                </pic:pic>
+              </a:graphicData>
+            </a:graphic>
+          </wp:anchor>
+        </w:drawing>
+      </w:r>
+      <w:r>
+        <w:t xml:space="preserve">Since Gameplay State was mostly a placeholder and for testing purposes only. I implemented the Phase 1 requirement which didn’t want us to implement anything to complex such as saving feature and Gameplay class uses enter method to set the scene as Void World for the player and only accepts commands </w:t>
+      </w:r>
+      <w:r>
+        <w:t>“</w:t>
+      </w:r>
+      <w:r>
+        <w:t>quit</w:t>
+      </w:r>
+      <w:r>
+        <w:t>”</w:t>
+      </w:r>
+      <w:r>
+        <w:t xml:space="preserve"> and </w:t>
+      </w:r>
+      <w:r>
+        <w:t>“</w:t>
+      </w:r>
+      <w:proofErr w:type="spellStart"/>
+      <w:r>
+        <w:t>hiscore</w:t>
+      </w:r>
+      <w:proofErr w:type="spellEnd"/>
+      <w:r>
+        <w:t>”</w:t>
+      </w:r>
+      <w:r>
+        <w:t xml:space="preserve"> with hardcoded results.</w:t>
+      </w:r>
+    </w:p>
     <w:sectPr>
-      <w:headerReference w:type="default" r:id="rId8"/>
+      <w:headerReference w:type="default" r:id="rId14"/>
       <w:pgSz w:w="11900" w:h="16840"/>
       <w:pgMar w:top="1440" w:right="1134" w:bottom="1440" w:left="1134" w:header="709" w:footer="709" w:gutter="0"/>
       <w:cols w:space="708"/>
@@ -925,7 +1985,7 @@
       <w:rPr>
         <w:noProof/>
       </w:rPr>
-      <w:t>17/10/23</w:t>
+      <w:t>18/10/23</w:t>
     </w:r>
     <w:r>
       <w:fldChar w:fldCharType="end"/>

</xml_diff>

<commit_message>
updated spike report to reflect changes
</commit_message>
<xml_diff>
--- a/08 - Spike - Game State Management/Task 08 - Lab Spike Report.docx
+++ b/08 - Spike - Game State Management/Task 08 - Lab Spike Report.docx
@@ -792,18 +792,12 @@
         <w:keepNext/>
         <w:spacing w:line="360" w:lineRule="auto"/>
       </w:pPr>
-    </w:p>
-    <w:p>
-      <w:pPr>
-        <w:keepNext/>
-        <w:spacing w:line="360" w:lineRule="auto"/>
-      </w:pPr>
       <w:r>
         <w:drawing>
-          <wp:inline distT="0" distB="0" distL="0" distR="0" wp14:anchorId="27A9BC24" wp14:editId="7B64A5D3">
-            <wp:extent cx="4742688" cy="2416643"/>
-            <wp:effectExtent l="0" t="0" r="1270" b="3175"/>
-            <wp:docPr id="316402645" name="Picture 1" descr="A computer screen shot of a diagram&#10;&#10;Description automatically generated"/>
+          <wp:inline distT="0" distB="0" distL="0" distR="0" wp14:anchorId="6CEB333E" wp14:editId="07E0A4D3">
+            <wp:extent cx="4846320" cy="3267945"/>
+            <wp:effectExtent l="0" t="0" r="0" b="8890"/>
+            <wp:docPr id="978298977" name="Picture 1" descr="A screenshot of a computer&#10;&#10;Description automatically generated"/>
             <wp:cNvGraphicFramePr>
               <a:graphicFrameLocks xmlns:a="http://schemas.openxmlformats.org/drawingml/2006/main" noChangeAspect="1"/>
             </wp:cNvGraphicFramePr>
@@ -811,7 +805,7 @@
               <a:graphicData uri="http://schemas.openxmlformats.org/drawingml/2006/picture">
                 <pic:pic xmlns:pic="http://schemas.openxmlformats.org/drawingml/2006/picture">
                   <pic:nvPicPr>
-                    <pic:cNvPr id="316402645" name="Picture 1" descr="A computer screen shot of a diagram&#10;&#10;Description automatically generated"/>
+                    <pic:cNvPr id="978298977" name="Picture 1" descr="A screenshot of a computer&#10;&#10;Description automatically generated"/>
                     <pic:cNvPicPr/>
                   </pic:nvPicPr>
                   <pic:blipFill>
@@ -823,7 +817,7 @@
                   <pic:spPr>
                     <a:xfrm>
                       <a:off x="0" y="0"/>
-                      <a:ext cx="4771953" cy="2431555"/>
+                      <a:ext cx="4855560" cy="3274175"/>
                     </a:xfrm>
                     <a:prstGeom prst="rect">
                       <a:avLst/>
@@ -864,7 +858,6 @@
       </w:r>
     </w:p>
     <w:p/>
-    <w:p/>
     <w:p>
       <w:pPr>
         <w:spacing w:line="360" w:lineRule="auto"/>
@@ -926,10 +919,10 @@
           <w:szCs w:val="28"/>
         </w:rPr>
         <w:drawing>
-          <wp:inline distT="0" distB="0" distL="0" distR="0" wp14:anchorId="6BE914B1" wp14:editId="0A309B6B">
-            <wp:extent cx="3364992" cy="1539495"/>
-            <wp:effectExtent l="0" t="0" r="6985" b="3810"/>
-            <wp:docPr id="755550337" name="Picture 1"/>
+          <wp:inline distT="0" distB="0" distL="0" distR="0" wp14:anchorId="53D60F2E" wp14:editId="3FA099EA">
+            <wp:extent cx="3489960" cy="3007199"/>
+            <wp:effectExtent l="0" t="0" r="0" b="3175"/>
+            <wp:docPr id="301611860" name="Picture 1"/>
             <wp:cNvGraphicFramePr>
               <a:graphicFrameLocks xmlns:a="http://schemas.openxmlformats.org/drawingml/2006/main" noChangeAspect="1"/>
             </wp:cNvGraphicFramePr>
@@ -950,13 +943,13 @@
                         </a:ext>
                       </a:extLst>
                     </a:blip>
-                    <a:srcRect l="6620" t="12023" r="6579" b="12574"/>
+                    <a:srcRect l="6982" t="8356" r="6484" b="8356"/>
                     <a:stretch/>
                   </pic:blipFill>
                   <pic:spPr bwMode="auto">
                     <a:xfrm>
                       <a:off x="0" y="0"/>
-                      <a:ext cx="3385347" cy="1548808"/>
+                      <a:ext cx="3502105" cy="3017664"/>
                     </a:xfrm>
                     <a:prstGeom prst="rect">
                       <a:avLst/>
@@ -995,41 +988,27 @@
           <w:color w:val="000000" w:themeColor="text1"/>
           <w:sz w:val="24"/>
         </w:rPr>
-        <w:t>Based on my initial UML design the State header was created to estabilishes a clear methods that every state needs to initalize, run, terminate and handle inputs.</w:t>
-      </w:r>
-    </w:p>
-    <w:p>
-      <w:pPr>
-        <w:spacing w:line="360" w:lineRule="auto"/>
-        <w:rPr>
-          <w:b/>
-          <w:color w:val="767171" w:themeColor="background2" w:themeShade="80"/>
-          <w:sz w:val="28"/>
-          <w:szCs w:val="28"/>
-        </w:rPr>
-      </w:pPr>
-    </w:p>
-    <w:p>
-      <w:pPr>
-        <w:spacing w:line="360" w:lineRule="auto"/>
-        <w:rPr>
-          <w:b/>
-          <w:color w:val="767171" w:themeColor="background2" w:themeShade="80"/>
-          <w:sz w:val="28"/>
-          <w:szCs w:val="28"/>
-        </w:rPr>
-      </w:pPr>
-    </w:p>
-    <w:p>
-      <w:pPr>
-        <w:spacing w:line="360" w:lineRule="auto"/>
-        <w:rPr>
-          <w:b/>
-          <w:color w:val="767171" w:themeColor="background2" w:themeShade="80"/>
-          <w:sz w:val="28"/>
-          <w:szCs w:val="28"/>
-        </w:rPr>
-      </w:pPr>
+        <w:lastRenderedPageBreak/>
+        <w:t xml:space="preserve">Based on my initial UML design the State header was created to estabilishes a clear methods that every state needs to </w:t>
+      </w:r>
+      <w:r>
+        <w:rPr>
+          <w:bCs/>
+          <w:noProof/>
+          <w:color w:val="000000" w:themeColor="text1"/>
+          <w:sz w:val="24"/>
+        </w:rPr>
+        <w:t>render, update and get user input</w:t>
+      </w:r>
+      <w:r>
+        <w:rPr>
+          <w:bCs/>
+          <w:noProof/>
+          <w:color w:val="000000" w:themeColor="text1"/>
+          <w:sz w:val="24"/>
+        </w:rPr>
+        <w:t>.</w:t>
+      </w:r>
     </w:p>
     <w:p>
       <w:pPr>
@@ -1043,26 +1022,24 @@
       </w:pPr>
       <w:r>
         <w:rPr>
-          <w:b/>
+          <w:bCs/>
           <w:noProof/>
-          <w:color w:val="767171" w:themeColor="background2" w:themeShade="80"/>
-          <w:sz w:val="28"/>
-          <w:szCs w:val="28"/>
-        </w:rPr>
-        <w:lastRenderedPageBreak/>
+          <w:color w:val="000000" w:themeColor="text1"/>
+          <w:sz w:val="24"/>
+        </w:rPr>
         <w:drawing>
-          <wp:anchor distT="0" distB="0" distL="114300" distR="114300" simplePos="0" relativeHeight="251659264" behindDoc="0" locked="0" layoutInCell="1" allowOverlap="1" wp14:anchorId="7FCF724C" wp14:editId="4826204A">
+          <wp:anchor distT="0" distB="0" distL="114300" distR="114300" simplePos="0" relativeHeight="251662336" behindDoc="0" locked="0" layoutInCell="1" allowOverlap="1" wp14:anchorId="57535A8A" wp14:editId="7EF472CC">
             <wp:simplePos x="0" y="0"/>
-            <wp:positionH relativeFrom="margin">
-              <wp:posOffset>3327400</wp:posOffset>
+            <wp:positionH relativeFrom="column">
+              <wp:posOffset>3440430</wp:posOffset>
             </wp:positionH>
             <wp:positionV relativeFrom="paragraph">
-              <wp:posOffset>0</wp:posOffset>
+              <wp:posOffset>251460</wp:posOffset>
             </wp:positionV>
-            <wp:extent cx="2364740" cy="3279140"/>
+            <wp:extent cx="1792605" cy="3550920"/>
             <wp:effectExtent l="0" t="0" r="0" b="0"/>
             <wp:wrapTopAndBottom/>
-            <wp:docPr id="2069948838" name="Picture 2"/>
+            <wp:docPr id="1598764610" name="Picture 3"/>
             <wp:cNvGraphicFramePr>
               <a:graphicFrameLocks xmlns:a="http://schemas.openxmlformats.org/drawingml/2006/main" noChangeAspect="1"/>
             </wp:cNvGraphicFramePr>
@@ -1070,7 +1047,7 @@
               <a:graphicData uri="http://schemas.openxmlformats.org/drawingml/2006/picture">
                 <pic:pic xmlns:pic="http://schemas.openxmlformats.org/drawingml/2006/picture">
                   <pic:nvPicPr>
-                    <pic:cNvPr id="0" name="Picture 2"/>
+                    <pic:cNvPr id="0" name="Picture 3"/>
                     <pic:cNvPicPr>
                       <a:picLocks noChangeAspect="1" noChangeArrowheads="1"/>
                     </pic:cNvPicPr>
@@ -1083,13 +1060,13 @@
                         </a:ext>
                       </a:extLst>
                     </a:blip>
-                    <a:srcRect l="6619" t="5054" r="7039" b="5466"/>
+                    <a:srcRect l="9687" t="4983" r="10625" b="8247"/>
                     <a:stretch/>
                   </pic:blipFill>
                   <pic:spPr bwMode="auto">
                     <a:xfrm>
                       <a:off x="0" y="0"/>
-                      <a:ext cx="2364740" cy="3279140"/>
+                      <a:ext cx="1792605" cy="3550920"/>
                     </a:xfrm>
                     <a:prstGeom prst="rect">
                       <a:avLst/>
@@ -1125,18 +1102,399 @@
           <w:szCs w:val="28"/>
         </w:rPr>
         <w:drawing>
-          <wp:anchor distT="0" distB="0" distL="114300" distR="114300" simplePos="0" relativeHeight="251658240" behindDoc="0" locked="0" layoutInCell="1" allowOverlap="1" wp14:anchorId="2EC70068" wp14:editId="67026B08">
+          <wp:anchor distT="0" distB="0" distL="114300" distR="114300" simplePos="0" relativeHeight="251663360" behindDoc="0" locked="0" layoutInCell="1" allowOverlap="1" wp14:anchorId="346CAAB5" wp14:editId="1F908E72">
+            <wp:simplePos x="0" y="0"/>
+            <wp:positionH relativeFrom="column">
+              <wp:posOffset>910590</wp:posOffset>
+            </wp:positionH>
+            <wp:positionV relativeFrom="paragraph">
+              <wp:posOffset>266700</wp:posOffset>
+            </wp:positionV>
+            <wp:extent cx="2026920" cy="3248532"/>
+            <wp:effectExtent l="0" t="0" r="0" b="9525"/>
+            <wp:wrapTopAndBottom/>
+            <wp:docPr id="688786623" name="Picture 2"/>
+            <wp:cNvGraphicFramePr>
+              <a:graphicFrameLocks xmlns:a="http://schemas.openxmlformats.org/drawingml/2006/main" noChangeAspect="1"/>
+            </wp:cNvGraphicFramePr>
+            <a:graphic xmlns:a="http://schemas.openxmlformats.org/drawingml/2006/main">
+              <a:graphicData uri="http://schemas.openxmlformats.org/drawingml/2006/picture">
+                <pic:pic xmlns:pic="http://schemas.openxmlformats.org/drawingml/2006/picture">
+                  <pic:nvPicPr>
+                    <pic:cNvPr id="0" name="Picture 2"/>
+                    <pic:cNvPicPr>
+                      <a:picLocks noChangeAspect="1" noChangeArrowheads="1"/>
+                    </pic:cNvPicPr>
+                  </pic:nvPicPr>
+                  <pic:blipFill rotWithShape="1">
+                    <a:blip r:embed="rId10">
+                      <a:extLst>
+                        <a:ext uri="{28A0092B-C50C-407E-A947-70E740481C1C}">
+                          <a14:useLocalDpi xmlns:a14="http://schemas.microsoft.com/office/drawing/2010/main" val="0"/>
+                        </a:ext>
+                      </a:extLst>
+                    </a:blip>
+                    <a:srcRect l="12659" t="8606" r="12152" b="9466"/>
+                    <a:stretch/>
+                  </pic:blipFill>
+                  <pic:spPr bwMode="auto">
+                    <a:xfrm>
+                      <a:off x="0" y="0"/>
+                      <a:ext cx="2026920" cy="3248532"/>
+                    </a:xfrm>
+                    <a:prstGeom prst="rect">
+                      <a:avLst/>
+                    </a:prstGeom>
+                    <a:noFill/>
+                    <a:ln>
+                      <a:noFill/>
+                    </a:ln>
+                    <a:extLst>
+                      <a:ext uri="{53640926-AAD7-44D8-BBD7-CCE9431645EC}">
+                        <a14:shadowObscured xmlns:a14="http://schemas.microsoft.com/office/drawing/2010/main"/>
+                      </a:ext>
+                    </a:extLst>
+                  </pic:spPr>
+                </pic:pic>
+              </a:graphicData>
+            </a:graphic>
+          </wp:anchor>
+        </w:drawing>
+      </w:r>
+      <w:r>
+        <w:rPr>
+          <w:b/>
+          <w:color w:val="767171" w:themeColor="background2" w:themeShade="80"/>
+          <w:sz w:val="28"/>
+          <w:szCs w:val="28"/>
+        </w:rPr>
+        <w:br/>
+      </w:r>
+    </w:p>
+    <w:p>
+      <w:pPr>
+        <w:spacing w:line="360" w:lineRule="auto"/>
+        <w:jc w:val="both"/>
+        <w:rPr>
+          <w:bCs/>
+          <w:noProof/>
+          <w:color w:val="000000" w:themeColor="text1"/>
+          <w:sz w:val="24"/>
+        </w:rPr>
+      </w:pPr>
+      <w:r>
+        <w:rPr>
+          <w:bCs/>
+          <w:color w:val="000000" w:themeColor="text1"/>
+          <w:sz w:val="24"/>
+        </w:rPr>
+        <w:t xml:space="preserve">To manage these states, I created the </w:t>
+      </w:r>
+      <w:proofErr w:type="spellStart"/>
+      <w:r>
+        <w:rPr>
+          <w:bCs/>
+          <w:color w:val="000000" w:themeColor="text1"/>
+          <w:sz w:val="24"/>
+        </w:rPr>
+        <w:t>GameManager</w:t>
+      </w:r>
+      <w:proofErr w:type="spellEnd"/>
+      <w:r>
+        <w:rPr>
+          <w:bCs/>
+          <w:color w:val="000000" w:themeColor="text1"/>
+          <w:sz w:val="24"/>
+        </w:rPr>
+        <w:t xml:space="preserve"> that connects with the games main loop each state and therefore I use the </w:t>
+      </w:r>
+      <w:proofErr w:type="spellStart"/>
+      <w:r>
+        <w:rPr>
+          <w:bCs/>
+          <w:color w:val="000000" w:themeColor="text1"/>
+          <w:sz w:val="24"/>
+        </w:rPr>
+        <w:t>currentstate</w:t>
+      </w:r>
+      <w:proofErr w:type="spellEnd"/>
+      <w:r>
+        <w:rPr>
+          <w:bCs/>
+          <w:color w:val="000000" w:themeColor="text1"/>
+          <w:sz w:val="24"/>
+        </w:rPr>
+        <w:t xml:space="preserve"> to manage and store the current state of the game. </w:t>
+      </w:r>
+      <w:proofErr w:type="spellStart"/>
+      <w:r>
+        <w:rPr>
+          <w:bCs/>
+          <w:color w:val="000000" w:themeColor="text1"/>
+          <w:sz w:val="24"/>
+        </w:rPr>
+        <w:t>GameManager</w:t>
+      </w:r>
+      <w:proofErr w:type="spellEnd"/>
+      <w:r>
+        <w:rPr>
+          <w:bCs/>
+          <w:color w:val="000000" w:themeColor="text1"/>
+          <w:sz w:val="24"/>
+        </w:rPr>
+        <w:t xml:space="preserve"> </w:t>
+      </w:r>
+      <w:r>
+        <w:rPr>
+          <w:bCs/>
+          <w:color w:val="000000" w:themeColor="text1"/>
+          <w:sz w:val="24"/>
+        </w:rPr>
+        <w:t xml:space="preserve">handles state transitions as well with methods such as </w:t>
+      </w:r>
+      <w:proofErr w:type="spellStart"/>
+      <w:r>
+        <w:rPr>
+          <w:bCs/>
+          <w:color w:val="000000" w:themeColor="text1"/>
+          <w:sz w:val="24"/>
+        </w:rPr>
+        <w:t>pushstate</w:t>
+      </w:r>
+      <w:proofErr w:type="spellEnd"/>
+      <w:r>
+        <w:rPr>
+          <w:bCs/>
+          <w:color w:val="000000" w:themeColor="text1"/>
+          <w:sz w:val="24"/>
+        </w:rPr>
+        <w:t xml:space="preserve"> and </w:t>
+      </w:r>
+      <w:proofErr w:type="spellStart"/>
+      <w:r>
+        <w:rPr>
+          <w:bCs/>
+          <w:color w:val="000000" w:themeColor="text1"/>
+          <w:sz w:val="24"/>
+        </w:rPr>
+        <w:t>popstate</w:t>
+      </w:r>
+      <w:proofErr w:type="spellEnd"/>
+      <w:r>
+        <w:rPr>
+          <w:bCs/>
+          <w:color w:val="000000" w:themeColor="text1"/>
+          <w:sz w:val="24"/>
+        </w:rPr>
+        <w:t xml:space="preserve"> to make sure that one instance of </w:t>
+      </w:r>
+      <w:proofErr w:type="spellStart"/>
+      <w:r>
+        <w:rPr>
+          <w:bCs/>
+          <w:color w:val="000000" w:themeColor="text1"/>
+          <w:sz w:val="24"/>
+        </w:rPr>
+        <w:t>GameManager</w:t>
+      </w:r>
+      <w:proofErr w:type="spellEnd"/>
+      <w:r>
+        <w:rPr>
+          <w:bCs/>
+          <w:color w:val="000000" w:themeColor="text1"/>
+          <w:sz w:val="24"/>
+        </w:rPr>
+        <w:t xml:space="preserve"> </w:t>
+      </w:r>
+      <w:r>
+        <w:rPr>
+          <w:bCs/>
+          <w:color w:val="000000" w:themeColor="text1"/>
+          <w:sz w:val="24"/>
+        </w:rPr>
+        <w:t xml:space="preserve">exists at a time by using </w:t>
+      </w:r>
+      <w:r>
+        <w:rPr>
+          <w:bCs/>
+          <w:color w:val="000000" w:themeColor="text1"/>
+          <w:sz w:val="24"/>
+        </w:rPr>
+        <w:t xml:space="preserve">a </w:t>
+      </w:r>
+      <w:r>
+        <w:rPr>
+          <w:bCs/>
+          <w:color w:val="000000" w:themeColor="text1"/>
+          <w:sz w:val="24"/>
+        </w:rPr>
+        <w:t>Singleton pattern.</w:t>
+      </w:r>
+    </w:p>
+    <w:p>
+      <w:pPr>
+        <w:spacing w:line="360" w:lineRule="auto"/>
+        <w:jc w:val="both"/>
+        <w:rPr>
+          <w:b/>
+          <w:color w:val="767171" w:themeColor="background2" w:themeShade="80"/>
+          <w:sz w:val="28"/>
+          <w:szCs w:val="28"/>
+        </w:rPr>
+      </w:pPr>
+    </w:p>
+    <w:p>
+      <w:pPr>
+        <w:spacing w:line="360" w:lineRule="auto"/>
+        <w:rPr>
+          <w:b/>
+          <w:color w:val="767171" w:themeColor="background2" w:themeShade="80"/>
+          <w:sz w:val="28"/>
+          <w:szCs w:val="28"/>
+        </w:rPr>
+      </w:pPr>
+      <w:r>
+        <w:rPr>
+          <w:b/>
+          <w:color w:val="767171" w:themeColor="background2" w:themeShade="80"/>
+          <w:sz w:val="28"/>
+          <w:szCs w:val="28"/>
+        </w:rPr>
+        <w:t>Developing Basic States</w:t>
+      </w:r>
+      <w:r>
+        <w:rPr>
+          <w:b/>
+          <w:color w:val="767171" w:themeColor="background2" w:themeShade="80"/>
+          <w:sz w:val="28"/>
+          <w:szCs w:val="28"/>
+        </w:rPr>
+        <w:t xml:space="preserve">: </w:t>
+      </w:r>
+    </w:p>
+    <w:p>
+      <w:pPr>
+        <w:spacing w:line="360" w:lineRule="auto"/>
+        <w:jc w:val="both"/>
+        <w:rPr>
+          <w:bCs/>
+          <w:noProof/>
+          <w:color w:val="000000" w:themeColor="text1"/>
+          <w:sz w:val="24"/>
+        </w:rPr>
+      </w:pPr>
+      <w:r>
+        <w:rPr>
+          <w:bCs/>
+          <w:noProof/>
+          <w:color w:val="000000" w:themeColor="text1"/>
+          <w:sz w:val="24"/>
+        </w:rPr>
+        <w:t>When developing basic states such as Mainmenu, we use the header file for MainMenu to be the blueprint that inherits from State.h so does other states with their own header file that inherits from State.h as well as we want to make sure our code follows OOP design principles.</w:t>
+      </w:r>
+    </w:p>
+    <w:p>
+      <w:pPr>
+        <w:spacing w:line="360" w:lineRule="auto"/>
+        <w:jc w:val="both"/>
+        <w:rPr>
+          <w:bCs/>
+          <w:noProof/>
+          <w:color w:val="000000" w:themeColor="text1"/>
+          <w:sz w:val="24"/>
+        </w:rPr>
+      </w:pPr>
+      <w:r>
+        <w:rPr>
+          <w:bCs/>
+          <w:noProof/>
+          <w:color w:val="000000" w:themeColor="text1"/>
+          <w:sz w:val="24"/>
+        </w:rPr>
+        <w:lastRenderedPageBreak/>
+        <w:drawing>
+          <wp:anchor distT="0" distB="0" distL="114300" distR="114300" simplePos="0" relativeHeight="251664384" behindDoc="0" locked="0" layoutInCell="1" allowOverlap="1" wp14:anchorId="284B5DDA" wp14:editId="2787590D">
             <wp:simplePos x="0" y="0"/>
             <wp:positionH relativeFrom="margin">
               <wp:align>left</wp:align>
             </wp:positionH>
             <wp:positionV relativeFrom="paragraph">
-              <wp:posOffset>0</wp:posOffset>
+              <wp:posOffset>106680</wp:posOffset>
             </wp:positionV>
-            <wp:extent cx="2694305" cy="3256280"/>
-            <wp:effectExtent l="0" t="0" r="0" b="1270"/>
+            <wp:extent cx="2849245" cy="6156960"/>
+            <wp:effectExtent l="0" t="0" r="8255" b="0"/>
+            <wp:wrapSquare wrapText="bothSides"/>
+            <wp:docPr id="262367478" name="Picture 5"/>
+            <wp:cNvGraphicFramePr>
+              <a:graphicFrameLocks xmlns:a="http://schemas.openxmlformats.org/drawingml/2006/main" noChangeAspect="1"/>
+            </wp:cNvGraphicFramePr>
+            <a:graphic xmlns:a="http://schemas.openxmlformats.org/drawingml/2006/main">
+              <a:graphicData uri="http://schemas.openxmlformats.org/drawingml/2006/picture">
+                <pic:pic xmlns:pic="http://schemas.openxmlformats.org/drawingml/2006/picture">
+                  <pic:nvPicPr>
+                    <pic:cNvPr id="0" name="Picture 5"/>
+                    <pic:cNvPicPr>
+                      <a:picLocks noChangeAspect="1" noChangeArrowheads="1"/>
+                    </pic:cNvPicPr>
+                  </pic:nvPicPr>
+                  <pic:blipFill rotWithShape="1">
+                    <a:blip r:embed="rId11">
+                      <a:extLst>
+                        <a:ext uri="{28A0092B-C50C-407E-A947-70E740481C1C}">
+                          <a14:useLocalDpi xmlns:a14="http://schemas.microsoft.com/office/drawing/2010/main" val="0"/>
+                        </a:ext>
+                      </a:extLst>
+                    </a:blip>
+                    <a:srcRect l="9007" t="7573" r="8696" b="4990"/>
+                    <a:stretch/>
+                  </pic:blipFill>
+                  <pic:spPr bwMode="auto">
+                    <a:xfrm>
+                      <a:off x="0" y="0"/>
+                      <a:ext cx="2849245" cy="6156960"/>
+                    </a:xfrm>
+                    <a:prstGeom prst="rect">
+                      <a:avLst/>
+                    </a:prstGeom>
+                    <a:noFill/>
+                    <a:ln>
+                      <a:noFill/>
+                    </a:ln>
+                    <a:extLst>
+                      <a:ext uri="{53640926-AAD7-44D8-BBD7-CCE9431645EC}">
+                        <a14:shadowObscured xmlns:a14="http://schemas.microsoft.com/office/drawing/2010/main"/>
+                      </a:ext>
+                    </a:extLst>
+                  </pic:spPr>
+                </pic:pic>
+              </a:graphicData>
+            </a:graphic>
+            <wp14:sizeRelV relativeFrom="margin">
+              <wp14:pctHeight>0</wp14:pctHeight>
+            </wp14:sizeRelV>
+          </wp:anchor>
+        </w:drawing>
+      </w:r>
+      <w:r>
+        <w:rPr>
+          <w:bCs/>
+          <w:noProof/>
+          <w:color w:val="000000" w:themeColor="text1"/>
+          <w:sz w:val="24"/>
+        </w:rPr>
+        <w:drawing>
+          <wp:anchor distT="0" distB="0" distL="114300" distR="114300" simplePos="0" relativeHeight="251665408" behindDoc="0" locked="0" layoutInCell="1" allowOverlap="1" wp14:anchorId="586DFD87" wp14:editId="19BB5820">
+            <wp:simplePos x="0" y="0"/>
+            <wp:positionH relativeFrom="column">
+              <wp:posOffset>2901950</wp:posOffset>
+            </wp:positionH>
+            <wp:positionV relativeFrom="paragraph">
+              <wp:posOffset>167640</wp:posOffset>
+            </wp:positionV>
+            <wp:extent cx="3273425" cy="3550920"/>
+            <wp:effectExtent l="0" t="0" r="3175" b="0"/>
             <wp:wrapTopAndBottom/>
-            <wp:docPr id="1616423376" name="Picture 4"/>
+            <wp:docPr id="952567728" name="Picture 4"/>
             <wp:cNvGraphicFramePr>
               <a:graphicFrameLocks xmlns:a="http://schemas.openxmlformats.org/drawingml/2006/main" noChangeAspect="1"/>
             </wp:cNvGraphicFramePr>
@@ -1150,20 +1508,20 @@
                     </pic:cNvPicPr>
                   </pic:nvPicPr>
                   <pic:blipFill rotWithShape="1">
-                    <a:blip r:embed="rId10">
+                    <a:blip r:embed="rId12">
                       <a:extLst>
                         <a:ext uri="{28A0092B-C50C-407E-A947-70E740481C1C}">
                           <a14:useLocalDpi xmlns:a14="http://schemas.microsoft.com/office/drawing/2010/main" val="0"/>
                         </a:ext>
                       </a:extLst>
                     </a:blip>
-                    <a:srcRect l="8777" t="8188" r="8772" b="8441"/>
+                    <a:srcRect l="11472" t="8736" r="12968" b="8922"/>
                     <a:stretch/>
                   </pic:blipFill>
                   <pic:spPr bwMode="auto">
                     <a:xfrm>
                       <a:off x="0" y="0"/>
-                      <a:ext cx="2710857" cy="3276407"/>
+                      <a:ext cx="3273425" cy="3550920"/>
                     </a:xfrm>
                     <a:prstGeom prst="rect">
                       <a:avLst/>
@@ -1190,136 +1548,92 @@
           </wp:anchor>
         </w:drawing>
       </w:r>
-      <w:r>
+    </w:p>
+    <w:p>
+      <w:pPr>
+        <w:spacing w:line="360" w:lineRule="auto"/>
+        <w:jc w:val="both"/>
+        <w:rPr>
+          <w:bCs/>
+          <w:color w:val="000000" w:themeColor="text1"/>
+          <w:sz w:val="24"/>
+        </w:rPr>
+      </w:pPr>
+      <w:r>
+        <w:rPr>
+          <w:bCs/>
+          <w:color w:val="000000" w:themeColor="text1"/>
+          <w:sz w:val="24"/>
+        </w:rPr>
+        <w:t xml:space="preserve">The </w:t>
+      </w:r>
+      <w:proofErr w:type="spellStart"/>
+      <w:r>
+        <w:rPr>
+          <w:bCs/>
+          <w:color w:val="000000" w:themeColor="text1"/>
+          <w:sz w:val="24"/>
+        </w:rPr>
+        <w:t>MainMenu</w:t>
+      </w:r>
+      <w:proofErr w:type="spellEnd"/>
+      <w:r>
+        <w:rPr>
+          <w:bCs/>
+          <w:color w:val="000000" w:themeColor="text1"/>
+          <w:sz w:val="24"/>
+        </w:rPr>
+        <w:t xml:space="preserve"> class</w:t>
+      </w:r>
+      <w:r>
+        <w:rPr>
+          <w:bCs/>
+          <w:color w:val="000000" w:themeColor="text1"/>
+          <w:sz w:val="24"/>
+        </w:rPr>
+        <w:t xml:space="preserve"> and all other states</w:t>
+      </w:r>
+      <w:r>
+        <w:rPr>
+          <w:bCs/>
+          <w:color w:val="000000" w:themeColor="text1"/>
+          <w:sz w:val="24"/>
+        </w:rPr>
+        <w:t xml:space="preserve"> utilises </w:t>
+      </w:r>
+      <w:r>
+        <w:rPr>
+          <w:bCs/>
+          <w:color w:val="000000" w:themeColor="text1"/>
+          <w:sz w:val="24"/>
+        </w:rPr>
+        <w:t xml:space="preserve">basically the same methods to render and process basic user input. We use constructors to set the manager to pop and push between states while using update method to process the user commands using a switch case statement to find the next state to push in the stack. Moreover, render handles in printing out a visual Main Menu with display options for users to know what they should be entering to move between states.  </w:t>
+      </w:r>
+    </w:p>
+    <w:p>
+      <w:pPr>
+        <w:spacing w:line="360" w:lineRule="auto"/>
+        <w:rPr>
+          <w:bCs/>
+          <w:color w:val="000000" w:themeColor="text1"/>
+          <w:sz w:val="24"/>
+        </w:rPr>
+      </w:pPr>
+    </w:p>
+    <w:p>
+      <w:pPr>
+        <w:spacing w:line="360" w:lineRule="auto"/>
         <w:rPr>
           <w:b/>
           <w:color w:val="767171" w:themeColor="background2" w:themeShade="80"/>
           <w:sz w:val="28"/>
           <w:szCs w:val="28"/>
         </w:rPr>
-        <w:br/>
-      </w:r>
-      <w:r>
-        <w:rPr>
-          <w:bCs/>
-          <w:color w:val="000000" w:themeColor="text1"/>
-          <w:sz w:val="24"/>
-        </w:rPr>
-        <w:t xml:space="preserve">To manage these states, I created the </w:t>
-      </w:r>
-      <w:proofErr w:type="spellStart"/>
-      <w:r>
-        <w:rPr>
-          <w:bCs/>
-          <w:color w:val="000000" w:themeColor="text1"/>
-          <w:sz w:val="24"/>
-        </w:rPr>
-        <w:t>StateManager</w:t>
-      </w:r>
-      <w:proofErr w:type="spellEnd"/>
-      <w:r>
-        <w:rPr>
-          <w:bCs/>
-          <w:color w:val="000000" w:themeColor="text1"/>
-          <w:sz w:val="24"/>
-        </w:rPr>
-        <w:t xml:space="preserve"> that connects with the games main loop each state and therefore I use the </w:t>
-      </w:r>
-      <w:proofErr w:type="spellStart"/>
-      <w:r>
-        <w:rPr>
-          <w:bCs/>
-          <w:color w:val="000000" w:themeColor="text1"/>
-          <w:sz w:val="24"/>
-        </w:rPr>
-        <w:t>currentstate</w:t>
-      </w:r>
-      <w:proofErr w:type="spellEnd"/>
-      <w:r>
-        <w:rPr>
-          <w:bCs/>
-          <w:color w:val="000000" w:themeColor="text1"/>
-          <w:sz w:val="24"/>
-        </w:rPr>
-        <w:t xml:space="preserve"> to manage and store the current state of the game. </w:t>
-      </w:r>
-      <w:proofErr w:type="spellStart"/>
-      <w:r>
-        <w:rPr>
-          <w:bCs/>
-          <w:color w:val="000000" w:themeColor="text1"/>
-          <w:sz w:val="24"/>
-        </w:rPr>
-        <w:t>StateManager</w:t>
-      </w:r>
-      <w:proofErr w:type="spellEnd"/>
-      <w:r>
-        <w:rPr>
-          <w:bCs/>
-          <w:color w:val="000000" w:themeColor="text1"/>
-          <w:sz w:val="24"/>
-        </w:rPr>
-        <w:t xml:space="preserve"> handles state transitions as well with methods such as </w:t>
-      </w:r>
-      <w:proofErr w:type="spellStart"/>
-      <w:r>
-        <w:rPr>
-          <w:bCs/>
-          <w:color w:val="000000" w:themeColor="text1"/>
-          <w:sz w:val="24"/>
-        </w:rPr>
-        <w:t>setState</w:t>
-      </w:r>
-      <w:proofErr w:type="spellEnd"/>
-      <w:r>
-        <w:rPr>
-          <w:bCs/>
-          <w:color w:val="000000" w:themeColor="text1"/>
-          <w:sz w:val="24"/>
-        </w:rPr>
-        <w:t xml:space="preserve"> and </w:t>
-      </w:r>
-      <w:proofErr w:type="spellStart"/>
-      <w:r>
-        <w:rPr>
-          <w:bCs/>
-          <w:color w:val="000000" w:themeColor="text1"/>
-          <w:sz w:val="24"/>
-        </w:rPr>
-        <w:t>changeState</w:t>
-      </w:r>
-      <w:proofErr w:type="spellEnd"/>
-      <w:r>
-        <w:rPr>
-          <w:bCs/>
-          <w:color w:val="000000" w:themeColor="text1"/>
-          <w:sz w:val="24"/>
-        </w:rPr>
-        <w:t xml:space="preserve"> to make sure that one instance of </w:t>
-      </w:r>
-      <w:proofErr w:type="spellStart"/>
-      <w:r>
-        <w:rPr>
-          <w:bCs/>
-          <w:color w:val="000000" w:themeColor="text1"/>
-          <w:sz w:val="24"/>
-        </w:rPr>
-        <w:t>StateManager</w:t>
-      </w:r>
-      <w:proofErr w:type="spellEnd"/>
-      <w:r>
-        <w:rPr>
-          <w:bCs/>
-          <w:color w:val="000000" w:themeColor="text1"/>
-          <w:sz w:val="24"/>
-        </w:rPr>
-        <w:t xml:space="preserve"> exists at a time by using Singleton pattern.</w:t>
-      </w:r>
-    </w:p>
-    <w:p>
-      <w:pPr>
-        <w:spacing w:line="360" w:lineRule="auto"/>
-        <w:jc w:val="both"/>
+      </w:pPr>
+    </w:p>
+    <w:p>
+      <w:pPr>
+        <w:spacing w:line="360" w:lineRule="auto"/>
         <w:rPr>
           <w:b/>
           <w:color w:val="767171" w:themeColor="background2" w:themeShade="80"/>
@@ -1338,81 +1652,129 @@
           <w:szCs w:val="28"/>
         </w:rPr>
       </w:pPr>
-      <w:r>
+    </w:p>
+    <w:p>
+      <w:pPr>
+        <w:spacing w:line="360" w:lineRule="auto"/>
         <w:rPr>
           <w:b/>
           <w:color w:val="767171" w:themeColor="background2" w:themeShade="80"/>
           <w:sz w:val="28"/>
           <w:szCs w:val="28"/>
         </w:rPr>
-        <w:t>Developing Basic States</w:t>
-      </w:r>
-      <w:r>
+      </w:pPr>
+    </w:p>
+    <w:p>
+      <w:pPr>
+        <w:spacing w:line="360" w:lineRule="auto"/>
         <w:rPr>
           <w:b/>
           <w:color w:val="767171" w:themeColor="background2" w:themeShade="80"/>
           <w:sz w:val="28"/>
           <w:szCs w:val="28"/>
         </w:rPr>
-        <w:t xml:space="preserve">: </w:t>
-      </w:r>
-    </w:p>
-    <w:p>
-      <w:pPr>
-        <w:spacing w:line="360" w:lineRule="auto"/>
-        <w:rPr>
-          <w:b/>
+      </w:pPr>
+    </w:p>
+    <w:p>
+      <w:pPr>
+        <w:spacing w:line="360" w:lineRule="auto"/>
+        <w:rPr>
+          <w:b/>
+          <w:color w:val="767171" w:themeColor="background2" w:themeShade="80"/>
+          <w:sz w:val="28"/>
+          <w:szCs w:val="28"/>
+        </w:rPr>
+      </w:pPr>
+    </w:p>
+    <w:p>
+      <w:pPr>
+        <w:spacing w:line="360" w:lineRule="auto"/>
+        <w:rPr>
+          <w:b/>
+          <w:color w:val="767171" w:themeColor="background2" w:themeShade="80"/>
+          <w:sz w:val="28"/>
+          <w:szCs w:val="28"/>
+        </w:rPr>
+      </w:pPr>
+    </w:p>
+    <w:p>
+      <w:pPr>
+        <w:spacing w:line="360" w:lineRule="auto"/>
+        <w:rPr>
+          <w:b/>
+          <w:color w:val="767171" w:themeColor="background2" w:themeShade="80"/>
+          <w:sz w:val="28"/>
+          <w:szCs w:val="28"/>
+        </w:rPr>
+      </w:pPr>
+      <w:r>
+        <w:rPr>
+          <w:b/>
+          <w:color w:val="767171" w:themeColor="background2" w:themeShade="80"/>
+          <w:sz w:val="28"/>
+          <w:szCs w:val="28"/>
+        </w:rPr>
+        <w:t>Gameplay</w:t>
+      </w:r>
+      <w:r>
+        <w:rPr>
+          <w:b/>
+          <w:color w:val="767171" w:themeColor="background2" w:themeShade="80"/>
+          <w:sz w:val="28"/>
+          <w:szCs w:val="28"/>
+        </w:rPr>
+        <w:t xml:space="preserve"> Phase</w:t>
+      </w:r>
+      <w:r>
+        <w:rPr>
+          <w:b/>
+          <w:color w:val="767171" w:themeColor="background2" w:themeShade="80"/>
+          <w:sz w:val="28"/>
+          <w:szCs w:val="28"/>
+        </w:rPr>
+        <w:t xml:space="preserve"> 1 </w:t>
+      </w:r>
+      <w:r>
+        <w:rPr>
+          <w:b/>
+          <w:color w:val="767171" w:themeColor="background2" w:themeShade="80"/>
+          <w:sz w:val="28"/>
+          <w:szCs w:val="28"/>
+        </w:rPr>
+        <w:t>Functionality:</w:t>
+      </w:r>
+      <w:r>
+        <w:rPr>
+          <w:b/>
+          <w:color w:val="767171" w:themeColor="background2" w:themeShade="80"/>
+          <w:sz w:val="28"/>
+          <w:szCs w:val="28"/>
+        </w:rPr>
+        <w:t xml:space="preserve"> </w:t>
+      </w:r>
+    </w:p>
+    <w:p>
+      <w:pPr>
+        <w:rPr>
           <w:noProof/>
-          <w:color w:val="767171" w:themeColor="background2" w:themeShade="80"/>
-          <w:sz w:val="28"/>
-          <w:szCs w:val="28"/>
-        </w:rPr>
-      </w:pPr>
-    </w:p>
-    <w:p>
-      <w:pPr>
-        <w:spacing w:line="360" w:lineRule="auto"/>
-        <w:jc w:val="both"/>
-        <w:rPr>
-          <w:bCs/>
+        </w:rPr>
+      </w:pPr>
+    </w:p>
+    <w:p>
+      <w:pPr>
+        <w:rPr>
           <w:noProof/>
-          <w:color w:val="000000" w:themeColor="text1"/>
-          <w:sz w:val="24"/>
-        </w:rPr>
-      </w:pPr>
-      <w:r>
-        <w:rPr>
-          <w:bCs/>
+        </w:rPr>
+      </w:pPr>
+      <w:r>
+        <w:rPr>
           <w:noProof/>
-          <w:color w:val="000000" w:themeColor="text1"/>
-          <w:sz w:val="24"/>
-        </w:rPr>
-        <w:t>When developing basic states such as Mainmenu, we use the header file for MainMenu to be the blueprint that inherits from State.h so does other states with their own header file that inherits from State.h as well as we want to make sure our code follows OOP design principles.</w:t>
-      </w:r>
-    </w:p>
-    <w:p>
-      <w:pPr>
-        <w:spacing w:line="360" w:lineRule="auto"/>
-        <w:jc w:val="both"/>
-        <w:rPr>
-          <w:bCs/>
-          <w:noProof/>
-          <w:color w:val="000000" w:themeColor="text1"/>
-          <w:sz w:val="24"/>
-        </w:rPr>
-      </w:pPr>
-      <w:r>
-        <w:rPr>
-          <w:bCs/>
-          <w:noProof/>
-          <w:color w:val="000000" w:themeColor="text1"/>
-          <w:sz w:val="24"/>
         </w:rPr>
         <w:drawing>
-          <wp:inline distT="0" distB="0" distL="0" distR="0" wp14:anchorId="2DAE3259" wp14:editId="01C76690">
-            <wp:extent cx="2340864" cy="1985761"/>
-            <wp:effectExtent l="0" t="0" r="2540" b="0"/>
-            <wp:docPr id="158297723" name="Picture 6"/>
+          <wp:inline distT="0" distB="0" distL="0" distR="0" wp14:anchorId="4878C221" wp14:editId="7EEDA66A">
+            <wp:extent cx="3657600" cy="3987299"/>
+            <wp:effectExtent l="0" t="0" r="0" b="0"/>
+            <wp:docPr id="1076230483" name="Picture 6" descr="A screenshot of a computer program&#10;&#10;Description automatically generated"/>
             <wp:cNvGraphicFramePr>
               <a:graphicFrameLocks xmlns:a="http://schemas.openxmlformats.org/drawingml/2006/main" noChangeAspect="1"/>
             </wp:cNvGraphicFramePr>
@@ -1420,26 +1782,26 @@
               <a:graphicData uri="http://schemas.openxmlformats.org/drawingml/2006/picture">
                 <pic:pic xmlns:pic="http://schemas.openxmlformats.org/drawingml/2006/picture">
                   <pic:nvPicPr>
-                    <pic:cNvPr id="0" name="Picture 6"/>
+                    <pic:cNvPr id="1076230483" name="Picture 6" descr="A screenshot of a computer program&#10;&#10;Description automatically generated"/>
                     <pic:cNvPicPr>
                       <a:picLocks noChangeAspect="1" noChangeArrowheads="1"/>
                     </pic:cNvPicPr>
                   </pic:nvPicPr>
                   <pic:blipFill rotWithShape="1">
-                    <a:blip r:embed="rId11">
+                    <a:blip r:embed="rId13">
                       <a:extLst>
                         <a:ext uri="{28A0092B-C50C-407E-A947-70E740481C1C}">
                           <a14:useLocalDpi xmlns:a14="http://schemas.microsoft.com/office/drawing/2010/main" val="0"/>
                         </a:ext>
                       </a:extLst>
                     </a:blip>
-                    <a:srcRect l="9979" t="11261" r="9779" b="11935"/>
+                    <a:srcRect l="5236" t="5045" r="6235" b="6194"/>
                     <a:stretch/>
                   </pic:blipFill>
                   <pic:spPr bwMode="auto">
                     <a:xfrm>
                       <a:off x="0" y="0"/>
-                      <a:ext cx="2344431" cy="1988787"/>
+                      <a:ext cx="3662608" cy="3992758"/>
                     </a:xfrm>
                     <a:prstGeom prst="rect">
                       <a:avLst/>
@@ -1465,343 +1827,6 @@
       <w:pPr>
         <w:spacing w:line="360" w:lineRule="auto"/>
         <w:jc w:val="both"/>
-        <w:rPr>
-          <w:bCs/>
-          <w:color w:val="000000" w:themeColor="text1"/>
-          <w:sz w:val="24"/>
-        </w:rPr>
-      </w:pPr>
-      <w:r>
-        <w:rPr>
-          <w:b/>
-          <w:noProof/>
-          <w:color w:val="767171" w:themeColor="background2" w:themeShade="80"/>
-          <w:sz w:val="28"/>
-          <w:szCs w:val="28"/>
-        </w:rPr>
-        <w:lastRenderedPageBreak/>
-        <w:drawing>
-          <wp:anchor distT="0" distB="0" distL="114300" distR="114300" simplePos="0" relativeHeight="251660288" behindDoc="0" locked="0" layoutInCell="1" allowOverlap="1" wp14:anchorId="62DBE6FC" wp14:editId="30F595E3">
-            <wp:simplePos x="0" y="0"/>
-            <wp:positionH relativeFrom="margin">
-              <wp:align>left</wp:align>
-            </wp:positionH>
-            <wp:positionV relativeFrom="paragraph">
-              <wp:posOffset>0</wp:posOffset>
-            </wp:positionV>
-            <wp:extent cx="3230880" cy="4717415"/>
-            <wp:effectExtent l="0" t="0" r="7620" b="6985"/>
-            <wp:wrapSquare wrapText="bothSides"/>
-            <wp:docPr id="529678827" name="Picture 5"/>
-            <wp:cNvGraphicFramePr>
-              <a:graphicFrameLocks xmlns:a="http://schemas.openxmlformats.org/drawingml/2006/main" noChangeAspect="1"/>
-            </wp:cNvGraphicFramePr>
-            <a:graphic xmlns:a="http://schemas.openxmlformats.org/drawingml/2006/main">
-              <a:graphicData uri="http://schemas.openxmlformats.org/drawingml/2006/picture">
-                <pic:pic xmlns:pic="http://schemas.openxmlformats.org/drawingml/2006/picture">
-                  <pic:nvPicPr>
-                    <pic:cNvPr id="0" name="Picture 5"/>
-                    <pic:cNvPicPr>
-                      <a:picLocks noChangeAspect="1" noChangeArrowheads="1"/>
-                    </pic:cNvPicPr>
-                  </pic:nvPicPr>
-                  <pic:blipFill rotWithShape="1">
-                    <a:blip r:embed="rId12">
-                      <a:extLst>
-                        <a:ext uri="{28A0092B-C50C-407E-A947-70E740481C1C}">
-                          <a14:useLocalDpi xmlns:a14="http://schemas.microsoft.com/office/drawing/2010/main" val="0"/>
-                        </a:ext>
-                      </a:extLst>
-                    </a:blip>
-                    <a:srcRect l="4592" t="3516" r="5183" b="3648"/>
-                    <a:stretch/>
-                  </pic:blipFill>
-                  <pic:spPr bwMode="auto">
-                    <a:xfrm>
-                      <a:off x="0" y="0"/>
-                      <a:ext cx="3230880" cy="4717415"/>
-                    </a:xfrm>
-                    <a:prstGeom prst="rect">
-                      <a:avLst/>
-                    </a:prstGeom>
-                    <a:noFill/>
-                    <a:ln>
-                      <a:noFill/>
-                    </a:ln>
-                    <a:extLst>
-                      <a:ext uri="{53640926-AAD7-44D8-BBD7-CCE9431645EC}">
-                        <a14:shadowObscured xmlns:a14="http://schemas.microsoft.com/office/drawing/2010/main"/>
-                      </a:ext>
-                    </a:extLst>
-                  </pic:spPr>
-                </pic:pic>
-              </a:graphicData>
-            </a:graphic>
-            <wp14:sizeRelH relativeFrom="page">
-              <wp14:pctWidth>0</wp14:pctWidth>
-            </wp14:sizeRelH>
-            <wp14:sizeRelV relativeFrom="page">
-              <wp14:pctHeight>0</wp14:pctHeight>
-            </wp14:sizeRelV>
-          </wp:anchor>
-        </w:drawing>
-      </w:r>
-      <w:r>
-        <w:rPr>
-          <w:bCs/>
-          <w:color w:val="000000" w:themeColor="text1"/>
-          <w:sz w:val="24"/>
-        </w:rPr>
-        <w:t xml:space="preserve">The </w:t>
-      </w:r>
-      <w:proofErr w:type="spellStart"/>
-      <w:r>
-        <w:rPr>
-          <w:bCs/>
-          <w:color w:val="000000" w:themeColor="text1"/>
-          <w:sz w:val="24"/>
-        </w:rPr>
-        <w:t>MainMenu</w:t>
-      </w:r>
-      <w:proofErr w:type="spellEnd"/>
-      <w:r>
-        <w:rPr>
-          <w:bCs/>
-          <w:color w:val="000000" w:themeColor="text1"/>
-          <w:sz w:val="24"/>
-        </w:rPr>
-        <w:t xml:space="preserve"> class utilises the initialize method to present a list of options for the user, </w:t>
-      </w:r>
-      <w:proofErr w:type="spellStart"/>
-      <w:r>
-        <w:rPr>
-          <w:bCs/>
-          <w:color w:val="000000" w:themeColor="text1"/>
-          <w:sz w:val="24"/>
-        </w:rPr>
-        <w:t>handleInput</w:t>
-      </w:r>
-      <w:proofErr w:type="spellEnd"/>
-      <w:r>
-        <w:rPr>
-          <w:bCs/>
-          <w:color w:val="000000" w:themeColor="text1"/>
-          <w:sz w:val="24"/>
-        </w:rPr>
-        <w:t xml:space="preserve"> method processes the user inputs using switch case where options are 1 to 5 that </w:t>
-      </w:r>
-      <w:r>
-        <w:rPr>
-          <w:bCs/>
-          <w:color w:val="000000" w:themeColor="text1"/>
-          <w:sz w:val="24"/>
-        </w:rPr>
-        <w:t>correspond to switching between states or exiting the game.</w:t>
-      </w:r>
-      <w:r>
-        <w:rPr>
-          <w:bCs/>
-          <w:color w:val="000000" w:themeColor="text1"/>
-          <w:sz w:val="24"/>
-        </w:rPr>
-        <w:t xml:space="preserve"> Other states use similar initialization and </w:t>
-      </w:r>
-      <w:proofErr w:type="spellStart"/>
-      <w:r>
-        <w:rPr>
-          <w:bCs/>
-          <w:color w:val="000000" w:themeColor="text1"/>
-          <w:sz w:val="24"/>
-        </w:rPr>
-        <w:t>handleInput</w:t>
-      </w:r>
-      <w:proofErr w:type="spellEnd"/>
-      <w:r>
-        <w:rPr>
-          <w:bCs/>
-          <w:color w:val="000000" w:themeColor="text1"/>
-          <w:sz w:val="24"/>
-        </w:rPr>
-        <w:t xml:space="preserve"> methods that bring it back to </w:t>
-      </w:r>
-      <w:proofErr w:type="spellStart"/>
-      <w:r>
-        <w:rPr>
-          <w:bCs/>
-          <w:color w:val="000000" w:themeColor="text1"/>
-          <w:sz w:val="24"/>
-        </w:rPr>
-        <w:t>MainMenu</w:t>
-      </w:r>
-      <w:proofErr w:type="spellEnd"/>
-      <w:r>
-        <w:rPr>
-          <w:bCs/>
-          <w:color w:val="000000" w:themeColor="text1"/>
-          <w:sz w:val="24"/>
-        </w:rPr>
-        <w:t xml:space="preserve"> state.</w:t>
-      </w:r>
-    </w:p>
-    <w:p>
-      <w:pPr>
-        <w:spacing w:line="360" w:lineRule="auto"/>
-        <w:rPr>
-          <w:bCs/>
-          <w:color w:val="000000" w:themeColor="text1"/>
-          <w:sz w:val="24"/>
-        </w:rPr>
-      </w:pPr>
-    </w:p>
-    <w:p>
-      <w:pPr>
-        <w:spacing w:line="360" w:lineRule="auto"/>
-        <w:rPr>
-          <w:b/>
-          <w:color w:val="767171" w:themeColor="background2" w:themeShade="80"/>
-          <w:sz w:val="28"/>
-          <w:szCs w:val="28"/>
-        </w:rPr>
-      </w:pPr>
-    </w:p>
-    <w:p>
-      <w:pPr>
-        <w:spacing w:line="360" w:lineRule="auto"/>
-        <w:rPr>
-          <w:b/>
-          <w:color w:val="767171" w:themeColor="background2" w:themeShade="80"/>
-          <w:sz w:val="28"/>
-          <w:szCs w:val="28"/>
-        </w:rPr>
-      </w:pPr>
-    </w:p>
-    <w:p>
-      <w:pPr>
-        <w:spacing w:line="360" w:lineRule="auto"/>
-        <w:rPr>
-          <w:b/>
-          <w:color w:val="767171" w:themeColor="background2" w:themeShade="80"/>
-          <w:sz w:val="28"/>
-          <w:szCs w:val="28"/>
-        </w:rPr>
-      </w:pPr>
-    </w:p>
-    <w:p>
-      <w:pPr>
-        <w:spacing w:line="360" w:lineRule="auto"/>
-        <w:rPr>
-          <w:b/>
-          <w:color w:val="767171" w:themeColor="background2" w:themeShade="80"/>
-          <w:sz w:val="28"/>
-          <w:szCs w:val="28"/>
-        </w:rPr>
-      </w:pPr>
-    </w:p>
-    <w:p>
-      <w:pPr>
-        <w:spacing w:line="360" w:lineRule="auto"/>
-        <w:rPr>
-          <w:b/>
-          <w:color w:val="767171" w:themeColor="background2" w:themeShade="80"/>
-          <w:sz w:val="28"/>
-          <w:szCs w:val="28"/>
-        </w:rPr>
-      </w:pPr>
-    </w:p>
-    <w:p>
-      <w:pPr>
-        <w:spacing w:line="360" w:lineRule="auto"/>
-        <w:rPr>
-          <w:b/>
-          <w:color w:val="767171" w:themeColor="background2" w:themeShade="80"/>
-          <w:sz w:val="28"/>
-          <w:szCs w:val="28"/>
-        </w:rPr>
-      </w:pPr>
-    </w:p>
-    <w:p>
-      <w:pPr>
-        <w:spacing w:line="360" w:lineRule="auto"/>
-        <w:rPr>
-          <w:b/>
-          <w:color w:val="767171" w:themeColor="background2" w:themeShade="80"/>
-          <w:sz w:val="28"/>
-          <w:szCs w:val="28"/>
-        </w:rPr>
-      </w:pPr>
-    </w:p>
-    <w:p>
-      <w:pPr>
-        <w:spacing w:line="360" w:lineRule="auto"/>
-        <w:rPr>
-          <w:b/>
-          <w:color w:val="767171" w:themeColor="background2" w:themeShade="80"/>
-          <w:sz w:val="28"/>
-          <w:szCs w:val="28"/>
-        </w:rPr>
-      </w:pPr>
-    </w:p>
-    <w:p>
-      <w:pPr>
-        <w:spacing w:line="360" w:lineRule="auto"/>
-        <w:rPr>
-          <w:b/>
-          <w:color w:val="767171" w:themeColor="background2" w:themeShade="80"/>
-          <w:sz w:val="28"/>
-          <w:szCs w:val="28"/>
-        </w:rPr>
-      </w:pPr>
-      <w:r>
-        <w:rPr>
-          <w:b/>
-          <w:color w:val="767171" w:themeColor="background2" w:themeShade="80"/>
-          <w:sz w:val="28"/>
-          <w:szCs w:val="28"/>
-        </w:rPr>
-        <w:t>Gameplay</w:t>
-      </w:r>
-      <w:r>
-        <w:rPr>
-          <w:b/>
-          <w:color w:val="767171" w:themeColor="background2" w:themeShade="80"/>
-          <w:sz w:val="28"/>
-          <w:szCs w:val="28"/>
-        </w:rPr>
-        <w:t xml:space="preserve"> Phase</w:t>
-      </w:r>
-      <w:r>
-        <w:rPr>
-          <w:b/>
-          <w:color w:val="767171" w:themeColor="background2" w:themeShade="80"/>
-          <w:sz w:val="28"/>
-          <w:szCs w:val="28"/>
-        </w:rPr>
-        <w:t xml:space="preserve"> 1 </w:t>
-      </w:r>
-      <w:r>
-        <w:rPr>
-          <w:b/>
-          <w:color w:val="767171" w:themeColor="background2" w:themeShade="80"/>
-          <w:sz w:val="28"/>
-          <w:szCs w:val="28"/>
-        </w:rPr>
-        <w:t>Functionality:</w:t>
-      </w:r>
-      <w:r>
-        <w:rPr>
-          <w:b/>
-          <w:color w:val="767171" w:themeColor="background2" w:themeShade="80"/>
-          <w:sz w:val="28"/>
-          <w:szCs w:val="28"/>
-        </w:rPr>
-        <w:t xml:space="preserve"> </w:t>
-      </w:r>
-    </w:p>
-    <w:p>
-      <w:pPr>
-        <w:rPr>
-          <w:noProof/>
-        </w:rPr>
       </w:pPr>
     </w:p>
     <w:p>
@@ -1810,97 +1835,7 @@
         <w:jc w:val="both"/>
       </w:pPr>
       <w:r>
-        <w:rPr>
-          <w:noProof/>
-        </w:rPr>
-        <w:drawing>
-          <wp:anchor distT="0" distB="0" distL="114300" distR="114300" simplePos="0" relativeHeight="251661312" behindDoc="0" locked="0" layoutInCell="1" allowOverlap="1" wp14:anchorId="7C91650F" wp14:editId="1D0B03B4">
-            <wp:simplePos x="0" y="0"/>
-            <wp:positionH relativeFrom="column">
-              <wp:posOffset>-243</wp:posOffset>
-            </wp:positionH>
-            <wp:positionV relativeFrom="paragraph">
-              <wp:posOffset>297</wp:posOffset>
-            </wp:positionV>
-            <wp:extent cx="3667327" cy="3086004"/>
-            <wp:effectExtent l="0" t="0" r="0" b="635"/>
-            <wp:wrapSquare wrapText="bothSides"/>
-            <wp:docPr id="1708141556" name="Picture 7"/>
-            <wp:cNvGraphicFramePr>
-              <a:graphicFrameLocks xmlns:a="http://schemas.openxmlformats.org/drawingml/2006/main" noChangeAspect="1"/>
-            </wp:cNvGraphicFramePr>
-            <a:graphic xmlns:a="http://schemas.openxmlformats.org/drawingml/2006/main">
-              <a:graphicData uri="http://schemas.openxmlformats.org/drawingml/2006/picture">
-                <pic:pic xmlns:pic="http://schemas.openxmlformats.org/drawingml/2006/picture">
-                  <pic:nvPicPr>
-                    <pic:cNvPr id="0" name="Picture 7"/>
-                    <pic:cNvPicPr>
-                      <a:picLocks noChangeAspect="1" noChangeArrowheads="1"/>
-                    </pic:cNvPicPr>
-                  </pic:nvPicPr>
-                  <pic:blipFill rotWithShape="1">
-                    <a:blip r:embed="rId13">
-                      <a:extLst>
-                        <a:ext uri="{28A0092B-C50C-407E-A947-70E740481C1C}">
-                          <a14:useLocalDpi xmlns:a14="http://schemas.microsoft.com/office/drawing/2010/main" val="0"/>
-                        </a:ext>
-                      </a:extLst>
-                    </a:blip>
-                    <a:srcRect l="4299" t="4503" r="5231" b="5802"/>
-                    <a:stretch/>
-                  </pic:blipFill>
-                  <pic:spPr bwMode="auto">
-                    <a:xfrm>
-                      <a:off x="0" y="0"/>
-                      <a:ext cx="3667327" cy="3086004"/>
-                    </a:xfrm>
-                    <a:prstGeom prst="rect">
-                      <a:avLst/>
-                    </a:prstGeom>
-                    <a:noFill/>
-                    <a:ln>
-                      <a:noFill/>
-                    </a:ln>
-                    <a:extLst>
-                      <a:ext uri="{53640926-AAD7-44D8-BBD7-CCE9431645EC}">
-                        <a14:shadowObscured xmlns:a14="http://schemas.microsoft.com/office/drawing/2010/main"/>
-                      </a:ext>
-                    </a:extLst>
-                  </pic:spPr>
-                </pic:pic>
-              </a:graphicData>
-            </a:graphic>
-          </wp:anchor>
-        </w:drawing>
-      </w:r>
-      <w:r>
-        <w:t xml:space="preserve">Since Gameplay State was mostly a placeholder and for testing purposes only. I implemented the Phase 1 requirement which didn’t want us to implement anything to complex such as saving feature and Gameplay class uses enter method to set the scene as Void World for the player and only accepts commands </w:t>
-      </w:r>
-      <w:r>
-        <w:t>“</w:t>
-      </w:r>
-      <w:r>
-        <w:t>quit</w:t>
-      </w:r>
-      <w:r>
-        <w:t>”</w:t>
-      </w:r>
-      <w:r>
-        <w:t xml:space="preserve"> and </w:t>
-      </w:r>
-      <w:r>
-        <w:t>“</w:t>
-      </w:r>
-      <w:proofErr w:type="spellStart"/>
-      <w:r>
-        <w:t>hiscore</w:t>
-      </w:r>
-      <w:proofErr w:type="spellEnd"/>
-      <w:r>
-        <w:t>”</w:t>
-      </w:r>
-      <w:r>
-        <w:t xml:space="preserve"> with hardcoded results.</w:t>
+        <w:t>Gameplay State is a bit different from other states as we process user inputs using string instead of int and this changes how the update method works as well.  Currently results are hardcoded but in later phases we will be implementing more complex ways of displaying desired results.</w:t>
       </w:r>
     </w:p>
     <w:sectPr>
@@ -1985,7 +1920,7 @@
       <w:rPr>
         <w:noProof/>
       </w:rPr>
-      <w:t>18/10/23</w:t>
+      <w:t>25/10/23</w:t>
     </w:r>
     <w:r>
       <w:fldChar w:fldCharType="end"/>

</xml_diff>

<commit_message>
Task 16 mixer done
</commit_message>
<xml_diff>
--- a/08 - Spike - Game State Management/Task 08 - Lab Spike Report.docx
+++ b/08 - Spike - Game State Management/Task 08 - Lab Spike Report.docx
@@ -146,25 +146,33 @@
           <w:sz w:val="24"/>
           <w:szCs w:val="24"/>
         </w:rPr>
-        <w:t xml:space="preserve">The goal of this spike task is to demonstrate my ability to collect and analyse software performance data while applying my knowledge in comparing and evaluating functions, </w:t>
-      </w:r>
-      <w:proofErr w:type="gramStart"/>
-      <w:r>
-        <w:rPr>
-          <w:rStyle w:val="SubtleReference"/>
-          <w:sz w:val="24"/>
-          <w:szCs w:val="24"/>
-        </w:rPr>
-        <w:t>IDE</w:t>
-      </w:r>
-      <w:proofErr w:type="gramEnd"/>
-      <w:r>
-        <w:rPr>
-          <w:rStyle w:val="SubtleReference"/>
-          <w:sz w:val="24"/>
-          <w:szCs w:val="24"/>
-        </w:rPr>
-        <w:t xml:space="preserve"> and complier settings.</w:t>
+        <w:t xml:space="preserve">The goal of this spike task is to demonstrate my ability </w:t>
+      </w:r>
+      <w:r>
+        <w:rPr>
+          <w:rStyle w:val="SubtleReference"/>
+          <w:sz w:val="24"/>
+          <w:szCs w:val="24"/>
+        </w:rPr>
+        <w:t xml:space="preserve">in implementing flexible game states while trying to replicate the </w:t>
+      </w:r>
+      <w:proofErr w:type="spellStart"/>
+      <w:r>
+        <w:rPr>
+          <w:rStyle w:val="SubtleReference"/>
+          <w:sz w:val="24"/>
+          <w:szCs w:val="24"/>
+        </w:rPr>
+        <w:t>Zorkish</w:t>
+      </w:r>
+      <w:proofErr w:type="spellEnd"/>
+      <w:r>
+        <w:rPr>
+          <w:rStyle w:val="SubtleReference"/>
+          <w:sz w:val="24"/>
+          <w:szCs w:val="24"/>
+        </w:rPr>
+        <w:t xml:space="preserve"> Adventure Game</w:t>
       </w:r>
     </w:p>
     <w:p>
@@ -736,7 +744,6 @@
           <w:b/>
           <w:sz w:val="24"/>
         </w:rPr>
-        <w:lastRenderedPageBreak/>
         <w:t>What we found out:</w:t>
       </w:r>
     </w:p>

</xml_diff>